<commit_message>
feat: add Streamlit shopping interface
</commit_message>
<xml_diff>
--- a/deliverables/Smart_Shopping_Price_Comparison_AI_Agent_Report_Reaksmey_Rin_Educational_Enhanced.docx
+++ b/deliverables/Smart_Shopping_Price_Comparison_AI_Agent_Report_Reaksmey_Rin_Educational_Enhanced.docx
@@ -386,7 +386,7 @@
           </w:tcPr>
           <w:p>
             <w:r>
-              <w:t>Evidence-based Markdown and PDF purchasing reports</w:t>
+              <w:t>Streamlit interface with evidence-based Markdown and PDF reports</w:t>
             </w:r>
           </w:p>
         </w:tc>
@@ -575,7 +575,7 @@
         <w:widowControl/>
       </w:pPr>
       <w:r>
-        <w:t>The system is built with CrewAI and uses three specialized agents. The first agent searches for products that match the user’s request and verifies selected pages. The second agent compares the available prices, specifications, sellers, warranties, delivery details, and overall value. The final agent selects the best-supported option. The tasks exchange validated Pydantic objects, and a deterministic Python callback renders the final result as matching Markdown and PDF reports with alternatives and source URLs.</w:t>
+        <w:t>The system is built with CrewAI and uses three specialized agents. The first agent searches for products that match the user’s request and verifies selected pages. The second agent compares the available prices, specifications, sellers, warranties, delivery details, and overall value. The final agent selects the best-supported option. The tasks exchange validated Pydantic objects, and a deterministic Python callback renders the final result as matching Markdown and PDF reports with alternatives and source URLs. A Streamlit web interface now lets a local user submit a request, follow the run status, read the Markdown report, and download either report format from a browser.</w:t>
       </w:r>
     </w:p>
     <w:tbl>
@@ -801,7 +801,7 @@
           </w:tcPr>
           <w:p>
             <w:r>
-              <w:t>11–15</w:t>
+              <w:t>11–16</w:t>
             </w:r>
           </w:p>
         </w:tc>
@@ -812,7 +812,7 @@
           </w:tcPr>
           <w:p>
             <w:r>
-              <w:t>Evaluation, safe buying, limitations, improvements, and conclusion</w:t>
+              <w:t>Web interface, evaluation, safe buying, limitations, improvements, and conclusion</w:t>
             </w:r>
           </w:p>
         </w:tc>
@@ -854,7 +854,7 @@
         <w:widowControl/>
       </w:pPr>
       <w:r>
-        <w:t>This project addresses that gap by turning the shopping process into a small research workflow. Instead of generating an immediate answer from memory, the system searches current web sources, organizes the findings, and produces a recommendation that can be checked by the user.</w:t>
+        <w:t>This project addresses that gap by turning the shopping process into a small research workflow. Instead of generating an immediate answer from memory, the system searches current web sources, organizes the findings, and produces a recommendation that can be checked by the user. The workflow can be started from the command line or through a local Streamlit interface designed for a clearer, beginner-friendly experience.</w:t>
       </w:r>
     </w:p>
     <w:p>
@@ -1013,7 +1013,7 @@
         <w:widowControl/>
       </w:pPr>
       <w:r>
-        <w:t>Provide direct source URLs and label missing evidence clearly.</w:t>
+        <w:t>Provide direct source URLs, label missing evidence clearly, and make the resulting reports easy to read and download in a browser.</w:t>
       </w:r>
     </w:p>
     <w:p>
@@ -1044,6 +1044,7 @@
         <w:tblStyle w:val="TableGrid"/>
         <w:tblW w:type="auto" w:w="0"/>
         <w:jc w:val="center"/>
+        <w:tblLayout w:type="autofit"/>
         <w:tblLook w:firstColumn="1" w:firstRow="1" w:lastColumn="0" w:lastRow="0" w:noHBand="0" w:noVBand="1" w:val="04A0"/>
       </w:tblPr>
       <w:tblGrid>
@@ -1055,20 +1056,30 @@
         <w:trPr>
           <w:tblHeader w:val="true"/>
           <w:cantSplit/>
+          <w:cantSplit/>
+          <w:tblHeader w:val="true"/>
         </w:trPr>
         <w:tc>
           <w:tcPr>
-            <w:tcW w:type="dxa" w:w="3331"/>
-            <w:shd w:fill="1F3A5F"/>
+            <w:tcW w:type="dxa" w:w="1728"/>
+            <w:shd w:fill="17375E"/>
+            <w:tcMar>
+              <w:top w:w="80" w:type="dxa"/>
+              <w:start w:w="90" w:type="dxa"/>
+              <w:bottom w:w="80" w:type="dxa"/>
+              <w:end w:w="90" w:type="dxa"/>
+            </w:tcMar>
+            <w:vAlign w:val="center"/>
           </w:tcPr>
           <w:p>
             <w:pPr>
-              <w:spacing w:after="30" w:before="0"/>
+              <w:spacing w:after="0" w:before="0"/>
             </w:pPr>
             <w:r>
               <w:rPr>
                 <w:b/>
                 <w:color w:val="FFFFFF"/>
+                <w:sz w:val="16"/>
               </w:rPr>
               <w:t>Technology</w:t>
             </w:r>
@@ -1076,17 +1087,25 @@
         </w:tc>
         <w:tc>
           <w:tcPr>
-            <w:tcW w:type="dxa" w:w="3331"/>
-            <w:shd w:fill="1F3A5F"/>
+            <w:tcW w:type="dxa" w:w="3240"/>
+            <w:shd w:fill="17375E"/>
+            <w:tcMar>
+              <w:top w:w="80" w:type="dxa"/>
+              <w:start w:w="90" w:type="dxa"/>
+              <w:bottom w:w="80" w:type="dxa"/>
+              <w:end w:w="90" w:type="dxa"/>
+            </w:tcMar>
+            <w:vAlign w:val="center"/>
           </w:tcPr>
           <w:p>
             <w:pPr>
-              <w:spacing w:after="30" w:before="0"/>
+              <w:spacing w:after="0" w:before="0"/>
             </w:pPr>
             <w:r>
               <w:rPr>
                 <w:b/>
                 <w:color w:val="FFFFFF"/>
+                <w:sz w:val="16"/>
               </w:rPr>
               <w:t>Role in the Project</w:t>
             </w:r>
@@ -1094,19 +1113,513 @@
         </w:tc>
         <w:tc>
           <w:tcPr>
-            <w:tcW w:type="dxa" w:w="3331"/>
-            <w:shd w:fill="1F3A5F"/>
+            <w:tcW w:type="dxa" w:w="3816"/>
+            <w:shd w:fill="17375E"/>
+            <w:tcMar>
+              <w:top w:w="80" w:type="dxa"/>
+              <w:start w:w="90" w:type="dxa"/>
+              <w:bottom w:w="80" w:type="dxa"/>
+              <w:end w:w="90" w:type="dxa"/>
+            </w:tcMar>
+            <w:vAlign w:val="center"/>
           </w:tcPr>
           <w:p>
             <w:pPr>
-              <w:spacing w:after="30" w:before="0"/>
+              <w:spacing w:after="0" w:before="0"/>
             </w:pPr>
             <w:r>
               <w:rPr>
                 <w:b/>
                 <w:color w:val="FFFFFF"/>
+                <w:sz w:val="16"/>
               </w:rPr>
               <w:t>Why It Was Chosen</w:t>
+            </w:r>
+          </w:p>
+        </w:tc>
+      </w:tr>
+      <w:tr>
+        <w:trPr>
+          <w:cantSplit/>
+          <w:cantSplit/>
+        </w:trPr>
+        <w:tc>
+          <w:tcPr>
+            <w:tcW w:type="dxa" w:w="1728"/>
+            <w:tcMar>
+              <w:top w:w="80" w:type="dxa"/>
+              <w:start w:w="90" w:type="dxa"/>
+              <w:bottom w:w="80" w:type="dxa"/>
+              <w:end w:w="90" w:type="dxa"/>
+            </w:tcMar>
+            <w:shd w:fill="DCE8F2"/>
+            <w:vAlign w:val="center"/>
+          </w:tcPr>
+          <w:p>
+            <w:pPr>
+              <w:spacing w:after="0" w:before="0"/>
+            </w:pPr>
+            <w:r>
+              <w:rPr>
+                <w:color w:val="243447"/>
+                <w:sz w:val="16"/>
+              </w:rPr>
+              <w:t>CrewAI</w:t>
+            </w:r>
+          </w:p>
+        </w:tc>
+        <w:tc>
+          <w:tcPr>
+            <w:tcW w:type="dxa" w:w="3240"/>
+            <w:tcMar>
+              <w:top w:w="80" w:type="dxa"/>
+              <w:start w:w="90" w:type="dxa"/>
+              <w:bottom w:w="80" w:type="dxa"/>
+              <w:end w:w="90" w:type="dxa"/>
+            </w:tcMar>
+            <w:shd w:fill="DCE8F2"/>
+            <w:vAlign w:val="center"/>
+          </w:tcPr>
+          <w:p>
+            <w:pPr>
+              <w:spacing w:after="0" w:before="0"/>
+            </w:pPr>
+            <w:r>
+              <w:rPr>
+                <w:color w:val="243447"/>
+                <w:sz w:val="16"/>
+              </w:rPr>
+              <w:t>Coordinates agents, tasks, context, and execution order.</w:t>
+            </w:r>
+          </w:p>
+        </w:tc>
+        <w:tc>
+          <w:tcPr>
+            <w:tcW w:type="dxa" w:w="3816"/>
+            <w:tcMar>
+              <w:top w:w="80" w:type="dxa"/>
+              <w:start w:w="90" w:type="dxa"/>
+              <w:bottom w:w="80" w:type="dxa"/>
+              <w:end w:w="90" w:type="dxa"/>
+            </w:tcMar>
+            <w:shd w:fill="DCE8F2"/>
+            <w:vAlign w:val="center"/>
+          </w:tcPr>
+          <w:p>
+            <w:pPr>
+              <w:spacing w:after="0" w:before="0"/>
+            </w:pPr>
+            <w:r>
+              <w:rPr>
+                <w:color w:val="243447"/>
+                <w:sz w:val="16"/>
+              </w:rPr>
+              <w:t>Provides a clear structure for multi-step work.</w:t>
+            </w:r>
+          </w:p>
+        </w:tc>
+      </w:tr>
+      <w:tr>
+        <w:trPr>
+          <w:cantSplit/>
+          <w:cantSplit/>
+        </w:trPr>
+        <w:tc>
+          <w:tcPr>
+            <w:tcW w:type="dxa" w:w="1728"/>
+            <w:shd w:fill="FFFFFF"/>
+            <w:tcMar>
+              <w:top w:w="80" w:type="dxa"/>
+              <w:start w:w="90" w:type="dxa"/>
+              <w:bottom w:w="80" w:type="dxa"/>
+              <w:end w:w="90" w:type="dxa"/>
+            </w:tcMar>
+            <w:vAlign w:val="center"/>
+          </w:tcPr>
+          <w:p>
+            <w:pPr>
+              <w:spacing w:after="0" w:before="0"/>
+            </w:pPr>
+            <w:r>
+              <w:rPr>
+                <w:color w:val="243447"/>
+                <w:sz w:val="16"/>
+              </w:rPr>
+              <w:t>DeepSeek V4 Flash</w:t>
+            </w:r>
+          </w:p>
+        </w:tc>
+        <w:tc>
+          <w:tcPr>
+            <w:tcW w:type="dxa" w:w="3240"/>
+            <w:shd w:fill="FFFFFF"/>
+            <w:tcMar>
+              <w:top w:w="80" w:type="dxa"/>
+              <w:start w:w="90" w:type="dxa"/>
+              <w:bottom w:w="80" w:type="dxa"/>
+              <w:end w:w="90" w:type="dxa"/>
+            </w:tcMar>
+            <w:vAlign w:val="center"/>
+          </w:tcPr>
+          <w:p>
+            <w:pPr>
+              <w:spacing w:after="0" w:before="0"/>
+            </w:pPr>
+            <w:r>
+              <w:rPr>
+                <w:color w:val="243447"/>
+                <w:sz w:val="16"/>
+              </w:rPr>
+              <w:t>Performs reasoning, comparison, and recommendation.</w:t>
+            </w:r>
+          </w:p>
+        </w:tc>
+        <w:tc>
+          <w:tcPr>
+            <w:tcW w:type="dxa" w:w="3816"/>
+            <w:shd w:fill="FFFFFF"/>
+            <w:tcMar>
+              <w:top w:w="80" w:type="dxa"/>
+              <w:start w:w="90" w:type="dxa"/>
+              <w:bottom w:w="80" w:type="dxa"/>
+              <w:end w:w="90" w:type="dxa"/>
+            </w:tcMar>
+            <w:vAlign w:val="center"/>
+          </w:tcPr>
+          <w:p>
+            <w:pPr>
+              <w:spacing w:after="0" w:before="0"/>
+            </w:pPr>
+            <w:r>
+              <w:rPr>
+                <w:color w:val="243447"/>
+                <w:sz w:val="16"/>
+              </w:rPr>
+              <w:t>Suitable for language-based analysis within the crew.</w:t>
+            </w:r>
+          </w:p>
+        </w:tc>
+      </w:tr>
+      <w:tr>
+        <w:trPr>
+          <w:cantSplit/>
+          <w:cantSplit/>
+        </w:trPr>
+        <w:tc>
+          <w:tcPr>
+            <w:tcW w:type="dxa" w:w="1728"/>
+            <w:tcMar>
+              <w:top w:w="80" w:type="dxa"/>
+              <w:start w:w="90" w:type="dxa"/>
+              <w:bottom w:w="80" w:type="dxa"/>
+              <w:end w:w="90" w:type="dxa"/>
+            </w:tcMar>
+            <w:shd w:fill="DCE8F2"/>
+            <w:vAlign w:val="center"/>
+          </w:tcPr>
+          <w:p>
+            <w:pPr>
+              <w:spacing w:after="0" w:before="0"/>
+            </w:pPr>
+            <w:r>
+              <w:rPr>
+                <w:color w:val="243447"/>
+                <w:sz w:val="16"/>
+              </w:rPr>
+              <w:t>ExaSearchTool</w:t>
+            </w:r>
+          </w:p>
+        </w:tc>
+        <w:tc>
+          <w:tcPr>
+            <w:tcW w:type="dxa" w:w="3240"/>
+            <w:tcMar>
+              <w:top w:w="80" w:type="dxa"/>
+              <w:start w:w="90" w:type="dxa"/>
+              <w:bottom w:w="80" w:type="dxa"/>
+              <w:end w:w="90" w:type="dxa"/>
+            </w:tcMar>
+            <w:shd w:fill="DCE8F2"/>
+            <w:vAlign w:val="center"/>
+          </w:tcPr>
+          <w:p>
+            <w:pPr>
+              <w:spacing w:after="0" w:before="0"/>
+            </w:pPr>
+            <w:r>
+              <w:rPr>
+                <w:color w:val="243447"/>
+                <w:sz w:val="16"/>
+              </w:rPr>
+              <w:t>Searches the web and returns product-related sources.</w:t>
+            </w:r>
+          </w:p>
+        </w:tc>
+        <w:tc>
+          <w:tcPr>
+            <w:tcW w:type="dxa" w:w="3816"/>
+            <w:tcMar>
+              <w:top w:w="80" w:type="dxa"/>
+              <w:start w:w="90" w:type="dxa"/>
+              <w:bottom w:w="80" w:type="dxa"/>
+              <w:end w:w="90" w:type="dxa"/>
+            </w:tcMar>
+            <w:shd w:fill="DCE8F2"/>
+            <w:vAlign w:val="center"/>
+          </w:tcPr>
+          <w:p>
+            <w:pPr>
+              <w:spacing w:after="0" w:before="0"/>
+            </w:pPr>
+            <w:r>
+              <w:rPr>
+                <w:color w:val="243447"/>
+                <w:sz w:val="16"/>
+              </w:rPr>
+              <w:t>Provides current information and source URLs.</w:t>
+            </w:r>
+          </w:p>
+        </w:tc>
+      </w:tr>
+      <w:tr>
+        <w:trPr>
+          <w:cantSplit/>
+          <w:cantSplit/>
+        </w:trPr>
+        <w:tc>
+          <w:tcPr>
+            <w:tcW w:type="dxa" w:w="1728"/>
+            <w:shd w:fill="FFFFFF"/>
+            <w:tcMar>
+              <w:top w:w="80" w:type="dxa"/>
+              <w:start w:w="90" w:type="dxa"/>
+              <w:bottom w:w="80" w:type="dxa"/>
+              <w:end w:w="90" w:type="dxa"/>
+            </w:tcMar>
+            <w:vAlign w:val="center"/>
+          </w:tcPr>
+          <w:p>
+            <w:pPr>
+              <w:spacing w:after="0" w:before="0"/>
+            </w:pPr>
+            <w:r>
+              <w:rPr>
+                <w:color w:val="243447"/>
+                <w:sz w:val="16"/>
+              </w:rPr>
+              <w:t>ScrapeWebsiteTool</w:t>
+            </w:r>
+          </w:p>
+        </w:tc>
+        <w:tc>
+          <w:tcPr>
+            <w:tcW w:type="dxa" w:w="3240"/>
+            <w:shd w:fill="FFFFFF"/>
+            <w:tcMar>
+              <w:top w:w="80" w:type="dxa"/>
+              <w:start w:w="90" w:type="dxa"/>
+              <w:bottom w:w="80" w:type="dxa"/>
+              <w:end w:w="90" w:type="dxa"/>
+            </w:tcMar>
+            <w:vAlign w:val="center"/>
+          </w:tcPr>
+          <w:p>
+            <w:pPr>
+              <w:spacing w:after="0" w:before="0"/>
+            </w:pPr>
+            <w:r>
+              <w:rPr>
+                <w:color w:val="243447"/>
+                <w:sz w:val="16"/>
+              </w:rPr>
+              <w:t>Reads selected product pages for verification.</w:t>
+            </w:r>
+          </w:p>
+        </w:tc>
+        <w:tc>
+          <w:tcPr>
+            <w:tcW w:type="dxa" w:w="3816"/>
+            <w:shd w:fill="FFFFFF"/>
+            <w:tcMar>
+              <w:top w:w="80" w:type="dxa"/>
+              <w:start w:w="90" w:type="dxa"/>
+              <w:bottom w:w="80" w:type="dxa"/>
+              <w:end w:w="90" w:type="dxa"/>
+            </w:tcMar>
+            <w:vAlign w:val="center"/>
+          </w:tcPr>
+          <w:p>
+            <w:pPr>
+              <w:spacing w:after="0" w:before="0"/>
+            </w:pPr>
+            <w:r>
+              <w:rPr>
+                <w:color w:val="243447"/>
+                <w:sz w:val="16"/>
+              </w:rPr>
+              <w:t>Helps confirm details beyond a search-result snippet.</w:t>
+            </w:r>
+          </w:p>
+        </w:tc>
+      </w:tr>
+      <w:tr>
+        <w:trPr>
+          <w:cantSplit/>
+          <w:cantSplit/>
+        </w:trPr>
+        <w:tc>
+          <w:tcPr>
+            <w:tcW w:type="dxa" w:w="1728"/>
+            <w:tcMar>
+              <w:top w:w="80" w:type="dxa"/>
+              <w:start w:w="90" w:type="dxa"/>
+              <w:bottom w:w="80" w:type="dxa"/>
+              <w:end w:w="90" w:type="dxa"/>
+            </w:tcMar>
+            <w:shd w:fill="DCE8F2"/>
+            <w:vAlign w:val="center"/>
+          </w:tcPr>
+          <w:p>
+            <w:pPr>
+              <w:spacing w:after="0" w:before="0"/>
+            </w:pPr>
+            <w:r>
+              <w:rPr>
+                <w:color w:val="243447"/>
+                <w:sz w:val="16"/>
+              </w:rPr>
+              <w:t>Pydantic</w:t>
+            </w:r>
+          </w:p>
+        </w:tc>
+        <w:tc>
+          <w:tcPr>
+            <w:tcW w:type="dxa" w:w="3240"/>
+            <w:tcMar>
+              <w:top w:w="80" w:type="dxa"/>
+              <w:start w:w="90" w:type="dxa"/>
+              <w:bottom w:w="80" w:type="dxa"/>
+              <w:end w:w="90" w:type="dxa"/>
+            </w:tcMar>
+            <w:shd w:fill="DCE8F2"/>
+            <w:vAlign w:val="center"/>
+          </w:tcPr>
+          <w:p>
+            <w:pPr>
+              <w:spacing w:after="0" w:before="0"/>
+            </w:pPr>
+            <w:r>
+              <w:rPr>
+                <w:color w:val="243447"/>
+                <w:sz w:val="16"/>
+              </w:rPr>
+              <w:t>Defines and validates the structured data exchanged between tasks.</w:t>
+            </w:r>
+          </w:p>
+        </w:tc>
+        <w:tc>
+          <w:tcPr>
+            <w:tcW w:type="dxa" w:w="3816"/>
+            <w:tcMar>
+              <w:top w:w="80" w:type="dxa"/>
+              <w:start w:w="90" w:type="dxa"/>
+              <w:bottom w:w="80" w:type="dxa"/>
+              <w:end w:w="90" w:type="dxa"/>
+            </w:tcMar>
+            <w:shd w:fill="DCE8F2"/>
+            <w:vAlign w:val="center"/>
+          </w:tcPr>
+          <w:p>
+            <w:pPr>
+              <w:spacing w:after="0" w:before="0"/>
+            </w:pPr>
+            <w:r>
+              <w:rPr>
+                <w:color w:val="243447"/>
+                <w:sz w:val="16"/>
+              </w:rPr>
+              <w:t>Provides consistent fields, types, and predictable task handoffs.</w:t>
+            </w:r>
+          </w:p>
+        </w:tc>
+      </w:tr>
+      <w:tr>
+        <w:trPr>
+          <w:cantSplit/>
+          <w:cantSplit/>
+        </w:trPr>
+        <w:tc>
+          <w:tcPr>
+            <w:tcW w:type="dxa" w:w="1728"/>
+            <w:tcMar>
+              <w:top w:w="80" w:type="dxa"/>
+              <w:start w:w="90" w:type="dxa"/>
+              <w:bottom w:w="80" w:type="dxa"/>
+              <w:end w:w="90" w:type="dxa"/>
+            </w:tcMar>
+            <w:shd w:fill="FFFFFF"/>
+            <w:vAlign w:val="center"/>
+          </w:tcPr>
+          <w:p>
+            <w:pPr>
+              <w:spacing w:after="0" w:before="0"/>
+            </w:pPr>
+            <w:r>
+              <w:rPr>
+                <w:color w:val="243447"/>
+                <w:sz w:val="16"/>
+              </w:rPr>
+              <w:t>Python + uv</w:t>
+            </w:r>
+          </w:p>
+        </w:tc>
+        <w:tc>
+          <w:tcPr>
+            <w:tcW w:type="dxa" w:w="3240"/>
+            <w:tcMar>
+              <w:top w:w="80" w:type="dxa"/>
+              <w:start w:w="90" w:type="dxa"/>
+              <w:bottom w:w="80" w:type="dxa"/>
+              <w:end w:w="90" w:type="dxa"/>
+            </w:tcMar>
+            <w:shd w:fill="FFFFFF"/>
+            <w:vAlign w:val="center"/>
+          </w:tcPr>
+          <w:p>
+            <w:pPr>
+              <w:spacing w:after="0" w:before="0"/>
+            </w:pPr>
+            <w:r>
+              <w:rPr>
+                <w:color w:val="243447"/>
+                <w:sz w:val="16"/>
+              </w:rPr>
+              <w:t>Runs the project and manages dependencies.</w:t>
+            </w:r>
+          </w:p>
+        </w:tc>
+        <w:tc>
+          <w:tcPr>
+            <w:tcW w:type="dxa" w:w="3816"/>
+            <w:tcMar>
+              <w:top w:w="80" w:type="dxa"/>
+              <w:start w:w="90" w:type="dxa"/>
+              <w:bottom w:w="80" w:type="dxa"/>
+              <w:end w:w="90" w:type="dxa"/>
+            </w:tcMar>
+            <w:shd w:fill="FFFFFF"/>
+            <w:vAlign w:val="center"/>
+          </w:tcPr>
+          <w:p>
+            <w:pPr>
+              <w:spacing w:after="0" w:before="0"/>
+            </w:pPr>
+            <w:r>
+              <w:rPr>
+                <w:color w:val="243447"/>
+                <w:sz w:val="16"/>
+              </w:rPr>
+              <w:t>Keeps the environment reproducible and easy to maintain.</w:t>
             </w:r>
           </w:p>
         </w:tc>
@@ -1117,394 +1630,7 @@
         </w:trPr>
         <w:tc>
           <w:tcPr>
-            <w:tcW w:type="dxa" w:w="3331"/>
-            <w:tcMar>
-              <w:top w:w="100" w:type="dxa"/>
-              <w:start w:w="110" w:type="dxa"/>
-              <w:bottom w:w="100" w:type="dxa"/>
-              <w:end w:w="110" w:type="dxa"/>
-            </w:tcMar>
-            <w:shd w:fill="DCE8F4"/>
-          </w:tcPr>
-          <w:p>
-            <w:pPr>
-              <w:spacing w:after="30" w:before="0"/>
-            </w:pPr>
-            <w:r>
-              <w:t>CrewAI</w:t>
-            </w:r>
-          </w:p>
-        </w:tc>
-        <w:tc>
-          <w:tcPr>
-            <w:tcW w:type="dxa" w:w="3331"/>
-            <w:tcMar>
-              <w:top w:w="100" w:type="dxa"/>
-              <w:start w:w="110" w:type="dxa"/>
-              <w:bottom w:w="100" w:type="dxa"/>
-              <w:end w:w="110" w:type="dxa"/>
-            </w:tcMar>
-            <w:shd w:fill="DCE8F4"/>
-          </w:tcPr>
-          <w:p>
-            <w:pPr>
-              <w:spacing w:after="30" w:before="0"/>
-            </w:pPr>
-            <w:r>
-              <w:t>Coordinates agents, tasks, context, and execution order.</w:t>
-            </w:r>
-          </w:p>
-        </w:tc>
-        <w:tc>
-          <w:tcPr>
-            <w:tcW w:type="dxa" w:w="3331"/>
-            <w:tcMar>
-              <w:top w:w="100" w:type="dxa"/>
-              <w:start w:w="110" w:type="dxa"/>
-              <w:bottom w:w="100" w:type="dxa"/>
-              <w:end w:w="110" w:type="dxa"/>
-            </w:tcMar>
-            <w:shd w:fill="DCE8F4"/>
-          </w:tcPr>
-          <w:p>
-            <w:pPr>
-              <w:spacing w:after="30" w:before="0"/>
-            </w:pPr>
-            <w:r>
-              <w:t>Provides a clear structure for multi-step work.</w:t>
-            </w:r>
-          </w:p>
-        </w:tc>
-      </w:tr>
-      <w:tr>
-        <w:trPr>
-          <w:cantSplit/>
-        </w:trPr>
-        <w:tc>
-          <w:tcPr>
-            <w:tcW w:type="dxa" w:w="3331"/>
-            <w:shd w:fill="FFFFFF"/>
-            <w:tcMar>
-              <w:top w:w="100" w:type="dxa"/>
-              <w:start w:w="110" w:type="dxa"/>
-              <w:bottom w:w="100" w:type="dxa"/>
-              <w:end w:w="110" w:type="dxa"/>
-            </w:tcMar>
-          </w:tcPr>
-          <w:p>
-            <w:pPr>
-              <w:spacing w:after="30" w:before="0"/>
-            </w:pPr>
-            <w:r>
-              <w:t>DeepSeek V4 Flash</w:t>
-            </w:r>
-          </w:p>
-        </w:tc>
-        <w:tc>
-          <w:tcPr>
-            <w:tcW w:type="dxa" w:w="3331"/>
-            <w:shd w:fill="FFFFFF"/>
-            <w:tcMar>
-              <w:top w:w="100" w:type="dxa"/>
-              <w:start w:w="110" w:type="dxa"/>
-              <w:bottom w:w="100" w:type="dxa"/>
-              <w:end w:w="110" w:type="dxa"/>
-            </w:tcMar>
-          </w:tcPr>
-          <w:p>
-            <w:pPr>
-              <w:spacing w:after="30" w:before="0"/>
-            </w:pPr>
-            <w:r>
-              <w:t>Performs reasoning, comparison, and recommendation.</w:t>
-            </w:r>
-          </w:p>
-        </w:tc>
-        <w:tc>
-          <w:tcPr>
-            <w:tcW w:type="dxa" w:w="3331"/>
-            <w:shd w:fill="FFFFFF"/>
-            <w:tcMar>
-              <w:top w:w="100" w:type="dxa"/>
-              <w:start w:w="110" w:type="dxa"/>
-              <w:bottom w:w="100" w:type="dxa"/>
-              <w:end w:w="110" w:type="dxa"/>
-            </w:tcMar>
-          </w:tcPr>
-          <w:p>
-            <w:pPr>
-              <w:spacing w:after="30" w:before="0"/>
-            </w:pPr>
-            <w:r>
-              <w:t>Suitable for language-based analysis within the crew.</w:t>
-            </w:r>
-          </w:p>
-        </w:tc>
-      </w:tr>
-      <w:tr>
-        <w:trPr>
-          <w:cantSplit/>
-        </w:trPr>
-        <w:tc>
-          <w:tcPr>
-            <w:tcW w:type="dxa" w:w="3331"/>
-            <w:tcMar>
-              <w:top w:w="100" w:type="dxa"/>
-              <w:start w:w="110" w:type="dxa"/>
-              <w:bottom w:w="100" w:type="dxa"/>
-              <w:end w:w="110" w:type="dxa"/>
-            </w:tcMar>
-            <w:shd w:fill="DCE8F4"/>
-          </w:tcPr>
-          <w:p>
-            <w:pPr>
-              <w:spacing w:after="30" w:before="0"/>
-            </w:pPr>
-            <w:r>
-              <w:t>ExaSearchTool</w:t>
-            </w:r>
-          </w:p>
-        </w:tc>
-        <w:tc>
-          <w:tcPr>
-            <w:tcW w:type="dxa" w:w="3331"/>
-            <w:tcMar>
-              <w:top w:w="100" w:type="dxa"/>
-              <w:start w:w="110" w:type="dxa"/>
-              <w:bottom w:w="100" w:type="dxa"/>
-              <w:end w:w="110" w:type="dxa"/>
-            </w:tcMar>
-            <w:shd w:fill="DCE8F4"/>
-          </w:tcPr>
-          <w:p>
-            <w:pPr>
-              <w:spacing w:after="30" w:before="0"/>
-            </w:pPr>
-            <w:r>
-              <w:t>Searches the web and returns product-related sources.</w:t>
-            </w:r>
-          </w:p>
-        </w:tc>
-        <w:tc>
-          <w:tcPr>
-            <w:tcW w:type="dxa" w:w="3331"/>
-            <w:tcMar>
-              <w:top w:w="100" w:type="dxa"/>
-              <w:start w:w="110" w:type="dxa"/>
-              <w:bottom w:w="100" w:type="dxa"/>
-              <w:end w:w="110" w:type="dxa"/>
-            </w:tcMar>
-            <w:shd w:fill="DCE8F4"/>
-          </w:tcPr>
-          <w:p>
-            <w:pPr>
-              <w:spacing w:after="30" w:before="0"/>
-            </w:pPr>
-            <w:r>
-              <w:t>Provides current information and source URLs.</w:t>
-            </w:r>
-          </w:p>
-        </w:tc>
-      </w:tr>
-      <w:tr>
-        <w:trPr>
-          <w:cantSplit/>
-        </w:trPr>
-        <w:tc>
-          <w:tcPr>
-            <w:tcW w:type="dxa" w:w="3331"/>
-            <w:shd w:fill="FFFFFF"/>
-            <w:tcMar>
-              <w:top w:w="100" w:type="dxa"/>
-              <w:start w:w="110" w:type="dxa"/>
-              <w:bottom w:w="100" w:type="dxa"/>
-              <w:end w:w="110" w:type="dxa"/>
-            </w:tcMar>
-          </w:tcPr>
-          <w:p>
-            <w:pPr>
-              <w:spacing w:after="30" w:before="0"/>
-            </w:pPr>
-            <w:r>
-              <w:t>ScrapeWebsiteTool</w:t>
-            </w:r>
-          </w:p>
-        </w:tc>
-        <w:tc>
-          <w:tcPr>
-            <w:tcW w:type="dxa" w:w="3331"/>
-            <w:shd w:fill="FFFFFF"/>
-            <w:tcMar>
-              <w:top w:w="100" w:type="dxa"/>
-              <w:start w:w="110" w:type="dxa"/>
-              <w:bottom w:w="100" w:type="dxa"/>
-              <w:end w:w="110" w:type="dxa"/>
-            </w:tcMar>
-          </w:tcPr>
-          <w:p>
-            <w:pPr>
-              <w:spacing w:after="30" w:before="0"/>
-            </w:pPr>
-            <w:r>
-              <w:t>Reads selected product pages for verification.</w:t>
-            </w:r>
-          </w:p>
-        </w:tc>
-        <w:tc>
-          <w:tcPr>
-            <w:tcW w:type="dxa" w:w="3331"/>
-            <w:shd w:fill="FFFFFF"/>
-            <w:tcMar>
-              <w:top w:w="100" w:type="dxa"/>
-              <w:start w:w="110" w:type="dxa"/>
-              <w:bottom w:w="100" w:type="dxa"/>
-              <w:end w:w="110" w:type="dxa"/>
-            </w:tcMar>
-          </w:tcPr>
-          <w:p>
-            <w:pPr>
-              <w:spacing w:after="30" w:before="0"/>
-            </w:pPr>
-            <w:r>
-              <w:t>Helps confirm details beyond a search-result snippet.</w:t>
-            </w:r>
-          </w:p>
-        </w:tc>
-      </w:tr>
-      <w:tr>
-        <w:trPr>
-          <w:cantSplit/>
-        </w:trPr>
-        <w:tc>
-          <w:tcPr>
-            <w:tcW w:type="dxa" w:w="3331"/>
-            <w:tcMar>
-              <w:top w:w="100" w:type="dxa"/>
-              <w:start w:w="110" w:type="dxa"/>
-              <w:bottom w:w="100" w:type="dxa"/>
-              <w:end w:w="110" w:type="dxa"/>
-            </w:tcMar>
-            <w:shd w:fill="DCE8F4"/>
-          </w:tcPr>
-          <w:p>
-            <w:pPr>
-              <w:spacing w:after="30" w:before="0"/>
-            </w:pPr>
-            <w:r>
-              <w:t>Pydantic</w:t>
-            </w:r>
-          </w:p>
-        </w:tc>
-        <w:tc>
-          <w:tcPr>
-            <w:tcW w:type="dxa" w:w="3331"/>
-            <w:tcMar>
-              <w:top w:w="100" w:type="dxa"/>
-              <w:start w:w="110" w:type="dxa"/>
-              <w:bottom w:w="100" w:type="dxa"/>
-              <w:end w:w="110" w:type="dxa"/>
-            </w:tcMar>
-            <w:shd w:fill="DCE8F4"/>
-          </w:tcPr>
-          <w:p>
-            <w:pPr>
-              <w:spacing w:after="30" w:before="0"/>
-            </w:pPr>
-            <w:r>
-              <w:t>Defines and validates the structured data exchanged between tasks.</w:t>
-            </w:r>
-          </w:p>
-        </w:tc>
-        <w:tc>
-          <w:tcPr>
-            <w:tcW w:type="dxa" w:w="3331"/>
-            <w:tcMar>
-              <w:top w:w="100" w:type="dxa"/>
-              <w:start w:w="110" w:type="dxa"/>
-              <w:bottom w:w="100" w:type="dxa"/>
-              <w:end w:w="110" w:type="dxa"/>
-            </w:tcMar>
-            <w:shd w:fill="DCE8F4"/>
-          </w:tcPr>
-          <w:p>
-            <w:pPr>
-              <w:spacing w:after="30" w:before="0"/>
-            </w:pPr>
-            <w:r>
-              <w:t>Provides consistent fields, types, and predictable task handoffs.</w:t>
-            </w:r>
-          </w:p>
-        </w:tc>
-      </w:tr>
-      <w:tr>
-        <w:trPr>
-          <w:cantSplit/>
-        </w:trPr>
-        <w:tc>
-          <w:tcPr>
-            <w:tcW w:type="dxa" w:w="3331"/>
-            <w:tcMar>
-              <w:top w:w="100" w:type="dxa"/>
-              <w:start w:w="110" w:type="dxa"/>
-              <w:bottom w:w="100" w:type="dxa"/>
-              <w:end w:w="110" w:type="dxa"/>
-            </w:tcMar>
-            <w:shd w:fill="DCE8F4"/>
-          </w:tcPr>
-          <w:p>
-            <w:pPr>
-              <w:spacing w:after="30" w:before="0"/>
-            </w:pPr>
-            <w:r>
-              <w:t>Python + uv</w:t>
-            </w:r>
-          </w:p>
-        </w:tc>
-        <w:tc>
-          <w:tcPr>
-            <w:tcW w:type="dxa" w:w="3331"/>
-            <w:tcMar>
-              <w:top w:w="100" w:type="dxa"/>
-              <w:start w:w="110" w:type="dxa"/>
-              <w:bottom w:w="100" w:type="dxa"/>
-              <w:end w:w="110" w:type="dxa"/>
-            </w:tcMar>
-            <w:shd w:fill="DCE8F4"/>
-          </w:tcPr>
-          <w:p>
-            <w:pPr>
-              <w:spacing w:after="30" w:before="0"/>
-            </w:pPr>
-            <w:r>
-              <w:t>Runs the project and manages dependencies.</w:t>
-            </w:r>
-          </w:p>
-        </w:tc>
-        <w:tc>
-          <w:tcPr>
-            <w:tcW w:type="dxa" w:w="3331"/>
-            <w:tcMar>
-              <w:top w:w="100" w:type="dxa"/>
-              <w:start w:w="110" w:type="dxa"/>
-              <w:bottom w:w="100" w:type="dxa"/>
-              <w:end w:w="110" w:type="dxa"/>
-            </w:tcMar>
-            <w:shd w:fill="DCE8F4"/>
-          </w:tcPr>
-          <w:p>
-            <w:pPr>
-              <w:spacing w:after="30" w:before="0"/>
-            </w:pPr>
-            <w:r>
-              <w:t>Keeps the environment reproducible and easy to maintain.</w:t>
-            </w:r>
-          </w:p>
-        </w:tc>
-      </w:tr>
-      <w:tr>
-        <w:tc>
-          <w:tcPr>
-            <w:tcW w:type="dxa" w:w="3331"/>
+            <w:tcW w:type="dxa" w:w="1728"/>
             <w:shd w:fill="DCE8F2"/>
             <w:tcMar>
               <w:top w:w="80" w:type="dxa"/>
@@ -1516,10 +1642,11 @@
           </w:tcPr>
           <w:p>
             <w:pPr>
-              <w:spacing w:after="0"/>
+              <w:spacing w:after="0" w:before="0"/>
             </w:pPr>
             <w:r>
               <w:rPr>
+                <w:color w:val="243447"/>
                 <w:sz w:val="16"/>
               </w:rPr>
               <w:t>PyMuPDF</w:t>
@@ -1528,7 +1655,7 @@
         </w:tc>
         <w:tc>
           <w:tcPr>
-            <w:tcW w:type="dxa" w:w="3331"/>
+            <w:tcW w:type="dxa" w:w="3240"/>
             <w:shd w:fill="DCE8F2"/>
             <w:tcMar>
               <w:top w:w="80" w:type="dxa"/>
@@ -1540,10 +1667,11 @@
           </w:tcPr>
           <w:p>
             <w:pPr>
-              <w:spacing w:after="0"/>
+              <w:spacing w:after="0" w:before="0"/>
             </w:pPr>
             <w:r>
               <w:rPr>
+                <w:color w:val="243447"/>
                 <w:sz w:val="16"/>
               </w:rPr>
               <w:t>Renders the validated recommendation as a printable PDF.</w:t>
@@ -1552,7 +1680,7 @@
         </w:tc>
         <w:tc>
           <w:tcPr>
-            <w:tcW w:type="dxa" w:w="3331"/>
+            <w:tcW w:type="dxa" w:w="3816"/>
             <w:shd w:fill="DCE8F2"/>
             <w:tcMar>
               <w:top w:w="80" w:type="dxa"/>
@@ -1564,13 +1692,94 @@
           </w:tcPr>
           <w:p>
             <w:pPr>
-              <w:spacing w:after="0"/>
+              <w:spacing w:after="0" w:before="0"/>
             </w:pPr>
             <w:r>
               <w:rPr>
+                <w:color w:val="243447"/>
                 <w:sz w:val="16"/>
               </w:rPr>
               <w:t>Creates a shareable report without another model call.</w:t>
+            </w:r>
+          </w:p>
+        </w:tc>
+      </w:tr>
+      <w:tr>
+        <w:trPr>
+          <w:cantSplit/>
+        </w:trPr>
+        <w:tc>
+          <w:tcPr>
+            <w:tcW w:type="dxa" w:w="1728"/>
+            <w:shd w:fill="FFFFFF"/>
+            <w:tcMar>
+              <w:top w:w="80" w:type="dxa"/>
+              <w:start w:w="90" w:type="dxa"/>
+              <w:bottom w:w="80" w:type="dxa"/>
+              <w:end w:w="90" w:type="dxa"/>
+            </w:tcMar>
+            <w:vAlign w:val="center"/>
+          </w:tcPr>
+          <w:p>
+            <w:pPr>
+              <w:spacing w:after="0" w:before="0"/>
+            </w:pPr>
+            <w:r>
+              <w:rPr>
+                <w:color w:val="243447"/>
+                <w:sz w:val="16"/>
+              </w:rPr>
+              <w:t>Streamlit</w:t>
+            </w:r>
+          </w:p>
+        </w:tc>
+        <w:tc>
+          <w:tcPr>
+            <w:tcW w:type="dxa" w:w="3240"/>
+            <w:shd w:fill="FFFFFF"/>
+            <w:tcMar>
+              <w:top w:w="80" w:type="dxa"/>
+              <w:start w:w="90" w:type="dxa"/>
+              <w:bottom w:w="80" w:type="dxa"/>
+              <w:end w:w="90" w:type="dxa"/>
+            </w:tcMar>
+            <w:vAlign w:val="center"/>
+          </w:tcPr>
+          <w:p>
+            <w:pPr>
+              <w:spacing w:after="0" w:before="0"/>
+            </w:pPr>
+            <w:r>
+              <w:rPr>
+                <w:color w:val="243447"/>
+                <w:sz w:val="16"/>
+              </w:rPr>
+              <w:t>Provides the local browser interface, progress feedback, report preview, and downloads.</w:t>
+            </w:r>
+          </w:p>
+        </w:tc>
+        <w:tc>
+          <w:tcPr>
+            <w:tcW w:type="dxa" w:w="3816"/>
+            <w:shd w:fill="FFFFFF"/>
+            <w:tcMar>
+              <w:top w:w="80" w:type="dxa"/>
+              <w:start w:w="90" w:type="dxa"/>
+              <w:bottom w:w="80" w:type="dxa"/>
+              <w:end w:w="90" w:type="dxa"/>
+            </w:tcMar>
+            <w:vAlign w:val="center"/>
+          </w:tcPr>
+          <w:p>
+            <w:pPr>
+              <w:spacing w:after="0" w:before="0"/>
+            </w:pPr>
+            <w:r>
+              <w:rPr>
+                <w:color w:val="243447"/>
+                <w:sz w:val="16"/>
+              </w:rPr>
+              <w:t>Integrates directly with the existing Python workflow and is easy to run for a project demonstration.</w:t>
             </w:r>
           </w:p>
         </w:tc>
@@ -1887,9 +2096,10 @@
     </w:p>
     <w:tbl>
       <w:tblPr>
+        <w:tblStyle w:val="TableGrid"/>
         <w:tblW w:type="auto" w:w="0"/>
         <w:jc w:val="center"/>
-        <w:tblLayout w:type="fixed"/>
+        <w:tblLayout w:type="autofit"/>
         <w:tblLook w:firstColumn="1" w:firstRow="1" w:lastColumn="0" w:lastRow="0" w:noHBand="0" w:noVBand="1" w:val="04A0"/>
       </w:tblPr>
       <w:tblGrid>
@@ -1899,28 +2109,31 @@
       <w:tr>
         <w:trPr>
           <w:cantSplit/>
+          <w:cantSplit/>
+          <w:tblHeader w:val="true"/>
         </w:trPr>
         <w:tc>
           <w:tcPr>
-            <w:tcW w:type="dxa" w:w="4997"/>
-            <w:shd w:fill="1F3A5F"/>
+            <w:tcW w:type="dxa" w:w="936"/>
+            <w:shd w:fill="17375E"/>
             <w:tcMar>
-              <w:top w:w="150" w:type="dxa"/>
-              <w:start w:w="80" w:type="dxa"/>
-              <w:bottom w:w="150" w:type="dxa"/>
-              <w:end w:w="80" w:type="dxa"/>
+              <w:top w:w="80" w:type="dxa"/>
+              <w:start w:w="90" w:type="dxa"/>
+              <w:bottom w:w="80" w:type="dxa"/>
+              <w:end w:w="90" w:type="dxa"/>
             </w:tcMar>
+            <w:vAlign w:val="center"/>
           </w:tcPr>
           <w:p>
             <w:pPr>
-              <w:spacing w:after="30" w:before="0"/>
+              <w:spacing w:after="0" w:before="0"/>
               <w:jc w:val="center"/>
             </w:pPr>
             <w:r>
               <w:rPr>
                 <w:b/>
                 <w:color w:val="FFFFFF"/>
-                <w:sz w:val="24"/>
+                <w:sz w:val="16"/>
               </w:rPr>
               <w:t>01</w:t>
             </w:r>
@@ -1928,21 +2141,259 @@
         </w:tc>
         <w:tc>
           <w:tcPr>
-            <w:tcW w:type="dxa" w:w="4997"/>
-            <w:shd w:fill="FFFFFF"/>
+            <w:tcW w:type="dxa" w:w="7992"/>
+            <w:shd w:fill="17375E"/>
             <w:tcMar>
-              <w:top w:w="150" w:type="dxa"/>
-              <w:start w:w="150" w:type="dxa"/>
-              <w:bottom w:w="150" w:type="dxa"/>
-              <w:end w:w="150" w:type="dxa"/>
+              <w:top w:w="80" w:type="dxa"/>
+              <w:start w:w="90" w:type="dxa"/>
+              <w:bottom w:w="80" w:type="dxa"/>
+              <w:end w:w="90" w:type="dxa"/>
             </w:tcMar>
+            <w:vAlign w:val="center"/>
           </w:tcPr>
           <w:p>
             <w:pPr>
-              <w:spacing w:after="30" w:before="0"/>
+              <w:spacing w:after="0" w:before="0"/>
             </w:pPr>
             <w:r>
-              <w:t>The user submits a shopping request through {product_query}.</w:t>
+              <w:rPr>
+                <w:b/>
+                <w:color w:val="FFFFFF"/>
+                <w:sz w:val="16"/>
+              </w:rPr>
+              <w:t>The user submits {product_query} through Streamlit or the CLI.</w:t>
+            </w:r>
+          </w:p>
+        </w:tc>
+      </w:tr>
+      <w:tr>
+        <w:trPr>
+          <w:cantSplit/>
+          <w:cantSplit/>
+        </w:trPr>
+        <w:tc>
+          <w:tcPr>
+            <w:tcW w:type="dxa" w:w="936"/>
+            <w:shd w:fill="DCE8F2"/>
+            <w:tcMar>
+              <w:top w:w="80" w:type="dxa"/>
+              <w:start w:w="90" w:type="dxa"/>
+              <w:bottom w:w="80" w:type="dxa"/>
+              <w:end w:w="90" w:type="dxa"/>
+            </w:tcMar>
+            <w:vAlign w:val="center"/>
+          </w:tcPr>
+          <w:p>
+            <w:pPr>
+              <w:spacing w:after="0" w:before="0"/>
+              <w:jc w:val="center"/>
+            </w:pPr>
+            <w:r>
+              <w:rPr>
+                <w:b/>
+                <w:color w:val="243447"/>
+                <w:sz w:val="16"/>
+              </w:rPr>
+              <w:t>02</w:t>
+            </w:r>
+          </w:p>
+        </w:tc>
+        <w:tc>
+          <w:tcPr>
+            <w:tcW w:type="dxa" w:w="7992"/>
+            <w:shd w:fill="DCE8F2"/>
+            <w:tcMar>
+              <w:top w:w="80" w:type="dxa"/>
+              <w:start w:w="90" w:type="dxa"/>
+              <w:bottom w:w="80" w:type="dxa"/>
+              <w:end w:w="90" w:type="dxa"/>
+            </w:tcMar>
+            <w:vAlign w:val="center"/>
+          </w:tcPr>
+          <w:p>
+            <w:pPr>
+              <w:spacing w:after="0" w:before="0"/>
+            </w:pPr>
+            <w:r>
+              <w:rPr>
+                <w:color w:val="243447"/>
+                <w:sz w:val="16"/>
+              </w:rPr>
+              <w:t>The search agent returns a validated ProductSearchResult.</w:t>
+            </w:r>
+          </w:p>
+        </w:tc>
+      </w:tr>
+      <w:tr>
+        <w:trPr>
+          <w:cantSplit/>
+          <w:cantSplit/>
+        </w:trPr>
+        <w:tc>
+          <w:tcPr>
+            <w:tcW w:type="dxa" w:w="936"/>
+            <w:shd w:fill="FFFFFF"/>
+            <w:tcMar>
+              <w:top w:w="80" w:type="dxa"/>
+              <w:start w:w="90" w:type="dxa"/>
+              <w:bottom w:w="80" w:type="dxa"/>
+              <w:end w:w="90" w:type="dxa"/>
+            </w:tcMar>
+            <w:vAlign w:val="center"/>
+          </w:tcPr>
+          <w:p>
+            <w:pPr>
+              <w:spacing w:after="0" w:before="0"/>
+              <w:jc w:val="center"/>
+            </w:pPr>
+            <w:r>
+              <w:rPr>
+                <w:b/>
+                <w:color w:val="243447"/>
+                <w:sz w:val="16"/>
+              </w:rPr>
+              <w:t>03</w:t>
+            </w:r>
+          </w:p>
+        </w:tc>
+        <w:tc>
+          <w:tcPr>
+            <w:tcW w:type="dxa" w:w="7992"/>
+            <w:shd w:fill="FFFFFF"/>
+            <w:tcMar>
+              <w:top w:w="80" w:type="dxa"/>
+              <w:start w:w="90" w:type="dxa"/>
+              <w:bottom w:w="80" w:type="dxa"/>
+              <w:end w:w="90" w:type="dxa"/>
+            </w:tcMar>
+            <w:vAlign w:val="center"/>
+          </w:tcPr>
+          <w:p>
+            <w:pPr>
+              <w:spacing w:after="0" w:before="0"/>
+            </w:pPr>
+            <w:r>
+              <w:rPr>
+                <w:color w:val="243447"/>
+                <w:sz w:val="16"/>
+              </w:rPr>
+              <w:t>The comparison agent returns a validated PriceComparisonResult.</w:t>
+            </w:r>
+          </w:p>
+        </w:tc>
+      </w:tr>
+      <w:tr>
+        <w:trPr>
+          <w:cantSplit/>
+          <w:cantSplit/>
+        </w:trPr>
+        <w:tc>
+          <w:tcPr>
+            <w:tcW w:type="dxa" w:w="936"/>
+            <w:shd w:fill="DCE8F2"/>
+            <w:tcMar>
+              <w:top w:w="80" w:type="dxa"/>
+              <w:start w:w="90" w:type="dxa"/>
+              <w:bottom w:w="80" w:type="dxa"/>
+              <w:end w:w="90" w:type="dxa"/>
+            </w:tcMar>
+            <w:vAlign w:val="center"/>
+          </w:tcPr>
+          <w:p>
+            <w:pPr>
+              <w:spacing w:after="0" w:before="0"/>
+              <w:jc w:val="center"/>
+            </w:pPr>
+            <w:r>
+              <w:rPr>
+                <w:b/>
+                <w:color w:val="243447"/>
+                <w:sz w:val="16"/>
+              </w:rPr>
+              <w:t>04</w:t>
+            </w:r>
+          </w:p>
+        </w:tc>
+        <w:tc>
+          <w:tcPr>
+            <w:tcW w:type="dxa" w:w="7992"/>
+            <w:shd w:fill="DCE8F2"/>
+            <w:tcMar>
+              <w:top w:w="80" w:type="dxa"/>
+              <w:start w:w="90" w:type="dxa"/>
+              <w:bottom w:w="80" w:type="dxa"/>
+              <w:end w:w="90" w:type="dxa"/>
+            </w:tcMar>
+            <w:vAlign w:val="center"/>
+          </w:tcPr>
+          <w:p>
+            <w:pPr>
+              <w:spacing w:after="0" w:before="0"/>
+            </w:pPr>
+            <w:r>
+              <w:rPr>
+                <w:color w:val="243447"/>
+                <w:sz w:val="16"/>
+              </w:rPr>
+              <w:t>The advisor returns a validated FinalRecommendationResult.</w:t>
+            </w:r>
+          </w:p>
+        </w:tc>
+      </w:tr>
+      <w:tr>
+        <w:trPr>
+          <w:cantSplit/>
+          <w:cantSplit/>
+        </w:trPr>
+        <w:tc>
+          <w:tcPr>
+            <w:tcW w:type="dxa" w:w="936"/>
+            <w:shd w:fill="FFFFFF"/>
+            <w:tcMar>
+              <w:top w:w="80" w:type="dxa"/>
+              <w:start w:w="90" w:type="dxa"/>
+              <w:bottom w:w="80" w:type="dxa"/>
+              <w:end w:w="90" w:type="dxa"/>
+            </w:tcMar>
+            <w:vAlign w:val="center"/>
+          </w:tcPr>
+          <w:p>
+            <w:pPr>
+              <w:spacing w:after="0" w:before="0"/>
+              <w:jc w:val="center"/>
+            </w:pPr>
+            <w:r>
+              <w:rPr>
+                <w:b/>
+                <w:color w:val="243447"/>
+                <w:sz w:val="16"/>
+              </w:rPr>
+              <w:t>05</w:t>
+            </w:r>
+          </w:p>
+        </w:tc>
+        <w:tc>
+          <w:tcPr>
+            <w:tcW w:type="dxa" w:w="7992"/>
+            <w:shd w:fill="FFFFFF"/>
+            <w:tcMar>
+              <w:top w:w="80" w:type="dxa"/>
+              <w:start w:w="90" w:type="dxa"/>
+              <w:bottom w:w="80" w:type="dxa"/>
+              <w:end w:w="90" w:type="dxa"/>
+            </w:tcMar>
+            <w:vAlign w:val="center"/>
+          </w:tcPr>
+          <w:p>
+            <w:pPr>
+              <w:spacing w:after="0" w:before="0"/>
+            </w:pPr>
+            <w:r>
+              <w:rPr>
+                <w:color w:val="243447"/>
+                <w:sz w:val="16"/>
+              </w:rPr>
+              <w:t>A Python callback renders the structured result to outputs/report.md and outputs/report.pdf.</w:t>
             </w:r>
           </w:p>
         </w:tc>
@@ -1953,197 +2404,51 @@
         </w:trPr>
         <w:tc>
           <w:tcPr>
-            <w:tcW w:type="dxa" w:w="4997"/>
-            <w:shd w:fill="1F3A5F"/>
+            <w:tcW w:type="dxa" w:w="936"/>
+            <w:shd w:fill="DCE8F2"/>
             <w:tcMar>
-              <w:top w:w="150" w:type="dxa"/>
-              <w:start w:w="80" w:type="dxa"/>
-              <w:bottom w:w="150" w:type="dxa"/>
-              <w:end w:w="80" w:type="dxa"/>
+              <w:top w:w="80" w:type="dxa"/>
+              <w:start w:w="90" w:type="dxa"/>
+              <w:bottom w:w="80" w:type="dxa"/>
+              <w:end w:w="90" w:type="dxa"/>
             </w:tcMar>
+            <w:vAlign w:val="center"/>
           </w:tcPr>
           <w:p>
             <w:pPr>
-              <w:spacing w:after="30" w:before="0"/>
-              <w:jc w:val="center"/>
+              <w:spacing w:after="0" w:before="0"/>
             </w:pPr>
             <w:r>
               <w:rPr>
-                <w:b/>
-                <w:color w:val="FFFFFF"/>
-                <w:sz w:val="24"/>
+                <w:color w:val="243447"/>
+                <w:sz w:val="16"/>
               </w:rPr>
-              <w:t>02</w:t>
+              <w:t>06</w:t>
             </w:r>
           </w:p>
         </w:tc>
         <w:tc>
           <w:tcPr>
-            <w:tcW w:type="dxa" w:w="4997"/>
-            <w:shd w:fill="DCE8F4"/>
+            <w:tcW w:type="dxa" w:w="7992"/>
+            <w:shd w:fill="DCE8F2"/>
             <w:tcMar>
-              <w:top w:w="150" w:type="dxa"/>
-              <w:start w:w="150" w:type="dxa"/>
-              <w:bottom w:w="150" w:type="dxa"/>
-              <w:end w:w="150" w:type="dxa"/>
+              <w:top w:w="80" w:type="dxa"/>
+              <w:start w:w="90" w:type="dxa"/>
+              <w:bottom w:w="80" w:type="dxa"/>
+              <w:end w:w="90" w:type="dxa"/>
             </w:tcMar>
+            <w:vAlign w:val="center"/>
           </w:tcPr>
           <w:p>
             <w:pPr>
-              <w:spacing w:after="30" w:before="0"/>
-            </w:pPr>
-            <w:r>
-              <w:t>The search agent returns a validated ProductSearchResult.</w:t>
-            </w:r>
-          </w:p>
-        </w:tc>
-      </w:tr>
-      <w:tr>
-        <w:trPr>
-          <w:cantSplit/>
-        </w:trPr>
-        <w:tc>
-          <w:tcPr>
-            <w:tcW w:type="dxa" w:w="4997"/>
-            <w:shd w:fill="1F3A5F"/>
-            <w:tcMar>
-              <w:top w:w="150" w:type="dxa"/>
-              <w:start w:w="80" w:type="dxa"/>
-              <w:bottom w:w="150" w:type="dxa"/>
-              <w:end w:w="80" w:type="dxa"/>
-            </w:tcMar>
-          </w:tcPr>
-          <w:p>
-            <w:pPr>
-              <w:spacing w:after="30" w:before="0"/>
-              <w:jc w:val="center"/>
+              <w:spacing w:after="0" w:before="0"/>
             </w:pPr>
             <w:r>
               <w:rPr>
-                <w:b/>
-                <w:color w:val="FFFFFF"/>
-                <w:sz w:val="24"/>
+                <w:color w:val="243447"/>
+                <w:sz w:val="16"/>
               </w:rPr>
-              <w:t>03</w:t>
-            </w:r>
-          </w:p>
-        </w:tc>
-        <w:tc>
-          <w:tcPr>
-            <w:tcW w:type="dxa" w:w="4997"/>
-            <w:shd w:fill="FFFFFF"/>
-            <w:tcMar>
-              <w:top w:w="150" w:type="dxa"/>
-              <w:start w:w="150" w:type="dxa"/>
-              <w:bottom w:w="150" w:type="dxa"/>
-              <w:end w:w="150" w:type="dxa"/>
-            </w:tcMar>
-          </w:tcPr>
-          <w:p>
-            <w:pPr>
-              <w:spacing w:after="30" w:before="0"/>
-            </w:pPr>
-            <w:r>
-              <w:t>The comparison agent returns a validated PriceComparisonResult.</w:t>
-            </w:r>
-          </w:p>
-        </w:tc>
-      </w:tr>
-      <w:tr>
-        <w:trPr>
-          <w:cantSplit/>
-        </w:trPr>
-        <w:tc>
-          <w:tcPr>
-            <w:tcW w:type="dxa" w:w="4997"/>
-            <w:shd w:fill="1F3A5F"/>
-            <w:tcMar>
-              <w:top w:w="150" w:type="dxa"/>
-              <w:start w:w="80" w:type="dxa"/>
-              <w:bottom w:w="150" w:type="dxa"/>
-              <w:end w:w="80" w:type="dxa"/>
-            </w:tcMar>
-          </w:tcPr>
-          <w:p>
-            <w:pPr>
-              <w:spacing w:after="30" w:before="0"/>
-              <w:jc w:val="center"/>
-            </w:pPr>
-            <w:r>
-              <w:rPr>
-                <w:b/>
-                <w:color w:val="FFFFFF"/>
-                <w:sz w:val="24"/>
-              </w:rPr>
-              <w:t>04</w:t>
-            </w:r>
-          </w:p>
-        </w:tc>
-        <w:tc>
-          <w:tcPr>
-            <w:tcW w:type="dxa" w:w="4997"/>
-            <w:shd w:fill="DCE8F4"/>
-            <w:tcMar>
-              <w:top w:w="150" w:type="dxa"/>
-              <w:start w:w="150" w:type="dxa"/>
-              <w:bottom w:w="150" w:type="dxa"/>
-              <w:end w:w="150" w:type="dxa"/>
-            </w:tcMar>
-          </w:tcPr>
-          <w:p>
-            <w:pPr>
-              <w:spacing w:after="30" w:before="0"/>
-            </w:pPr>
-            <w:r>
-              <w:t>The advisor returns a validated FinalRecommendationResult.</w:t>
-            </w:r>
-          </w:p>
-        </w:tc>
-      </w:tr>
-      <w:tr>
-        <w:trPr>
-          <w:cantSplit/>
-        </w:trPr>
-        <w:tc>
-          <w:tcPr>
-            <w:tcW w:type="dxa" w:w="4997"/>
-            <w:shd w:fill="1F3A5F"/>
-            <w:tcMar>
-              <w:top w:w="150" w:type="dxa"/>
-              <w:start w:w="80" w:type="dxa"/>
-              <w:bottom w:w="150" w:type="dxa"/>
-              <w:end w:w="80" w:type="dxa"/>
-            </w:tcMar>
-          </w:tcPr>
-          <w:p>
-            <w:pPr>
-              <w:spacing w:after="30" w:before="0"/>
-              <w:jc w:val="center"/>
-            </w:pPr>
-            <w:r>
-              <w:rPr>
-                <w:b/>
-                <w:color w:val="FFFFFF"/>
-                <w:sz w:val="24"/>
-              </w:rPr>
-              <w:t>05</w:t>
-            </w:r>
-          </w:p>
-        </w:tc>
-        <w:tc>
-          <w:tcPr>
-            <w:tcW w:type="dxa" w:w="4997"/>
-            <w:shd w:fill="FFFFFF"/>
-            <w:tcMar>
-              <w:top w:w="150" w:type="dxa"/>
-              <w:start w:w="150" w:type="dxa"/>
-              <w:bottom w:w="150" w:type="dxa"/>
-              <w:end w:w="150" w:type="dxa"/>
-            </w:tcMar>
-          </w:tcPr>
-          <w:p>
-            <w:r>
-              <w:t>A Python callback renders the structured result to outputs/report.md and outputs/report.pdf.</w:t>
+              <w:t>Streamlit previews the Markdown result and provides Markdown/PDF downloads.</w:t>
             </w:r>
           </w:p>
         </w:tc>
@@ -2160,7 +2465,7 @@
     <w:p>
       <w:pPr/>
       <w:r>
-        <w:t>The diagram below shows both the flow of information and the separation of responsibilities. Search tools are available only where new evidence is needed, while each completed stage passes a typed result to the next agent.</w:t>
+        <w:t>The diagram below shows how the browser interface starts the existing CrewAI workflow without changing its responsibilities. Search tools are available only where new evidence is needed, while each completed stage passes a typed result to the next agent. The validated final result is rendered once and returned to Streamlit for preview and download.</w:t>
       </w:r>
     </w:p>
     <w:p>
@@ -2172,7 +2477,7 @@
         <w:drawing>
           <wp:inline xmlns:a="http://schemas.openxmlformats.org/drawingml/2006/main" xmlns:pic="http://schemas.openxmlformats.org/drawingml/2006/picture">
             <wp:extent cx="5715000" cy="5715000"/>
-            <wp:docPr id="1" name="Picture 1" descr="Architecture diagram showing the user request, runtime checks, three sequential CrewAI agents, Pydantic handoffs, and Markdown and PDF report outputs." title="Smart Shopping AI Agent Architecture"/>
+            <wp:docPr id="1" name="Picture 1" descr="Architecture diagram showing the browser user, Streamlit interface, safe crew runner, runtime checks, three sequential CrewAI agents, Pydantic handoffs, and downloadable Markdown and PDF reports." title="Smart Shopping AI Agent Architecture"/>
             <wp:cNvGraphicFramePr>
               <a:graphicFrameLocks noChangeAspect="1"/>
             </wp:cNvGraphicFramePr>
@@ -2258,6 +2563,14 @@
       </w:pPr>
       <w:r>
         <w:t>Deterministic reporting: Python creates Markdown and PDF from one validated result, avoiding an additional model call.</w:t>
+      </w:r>
+    </w:p>
+    <w:p>
+      <w:pPr>
+        <w:pStyle w:val="ListBullet"/>
+      </w:pPr>
+      <w:r>
+        <w:t>Thin interface wrapper: Streamlit invokes the same crew command, so the browser experience reuses the existing schemas, safety checks, and reporting callback instead of duplicating them.</w:t>
       </w:r>
     </w:p>
     <w:p>
@@ -2393,6 +2706,7 @@
             </w:pPr>
             <w:r>
               <w:rPr>
+                <w:color w:val="243447"/>
                 <w:sz w:val="16"/>
               </w:rPr>
               <w:t>Research</w:t>
@@ -2417,6 +2731,7 @@
             </w:pPr>
             <w:r>
               <w:rPr>
+                <w:color w:val="243447"/>
                 <w:sz w:val="16"/>
               </w:rPr>
               <w:t>ProductSearchResult</w:t>
@@ -2441,6 +2756,7 @@
             </w:pPr>
             <w:r>
               <w:rPr>
+                <w:color w:val="243447"/>
                 <w:sz w:val="16"/>
               </w:rPr>
               <w:t>Requirements, product evidence, source URLs, research issues, and shortfall</w:t>
@@ -2470,6 +2786,7 @@
             </w:pPr>
             <w:r>
               <w:rPr>
+                <w:color w:val="243447"/>
                 <w:sz w:val="16"/>
               </w:rPr>
               <w:t>Comparison</w:t>
@@ -2494,6 +2811,7 @@
             </w:pPr>
             <w:r>
               <w:rPr>
+                <w:color w:val="243447"/>
                 <w:sz w:val="16"/>
               </w:rPr>
               <w:t>PriceComparisonResult</w:t>
@@ -2518,6 +2836,7 @@
             </w:pPr>
             <w:r>
               <w:rPr>
+                <w:color w:val="243447"/>
                 <w:sz w:val="16"/>
               </w:rPr>
               <w:t>Per-product costs, value analysis, price ranges, best-value deal, and limitations</w:t>
@@ -2547,6 +2866,7 @@
             </w:pPr>
             <w:r>
               <w:rPr>
+                <w:color w:val="243447"/>
                 <w:sz w:val="16"/>
               </w:rPr>
               <w:t>Recommendation</w:t>
@@ -2571,6 +2891,7 @@
             </w:pPr>
             <w:r>
               <w:rPr>
+                <w:color w:val="243447"/>
                 <w:sz w:val="16"/>
               </w:rPr>
               <w:t>FinalRecommendationResult</w:t>
@@ -2595,6 +2916,7 @@
             </w:pPr>
             <w:r>
               <w:rPr>
+                <w:color w:val="243447"/>
                 <w:sz w:val="16"/>
               </w:rPr>
               <w:t>Selected option, alternatives, confidence, checklist, and numbered sources</w:t>
@@ -3071,7 +3393,7 @@
         <w:widowControl/>
       </w:pPr>
       <w:r>
-        <w:t>The final advisor produces a validated FinalRecommendationResult. A deterministic Python callback then renders the same structured data into `outputs/report.md` and `outputs/report.pdf`. Both formats contain the same recommendation and sources, and PDF generation does not require another agent or model call.</w:t>
+        <w:t>The final advisor produces a validated FinalRecommendationResult. A deterministic Python callback then renders the same structured data into `outputs/report.md` and `outputs/report.pdf`. Both formats contain the same recommendation and sources, and PDF generation does not require another agent or model call. Streamlit previews the Markdown result and offers both files as downloads.</w:t>
       </w:r>
     </w:p>
     <w:p>
@@ -3156,6 +3478,584 @@
     </w:p>
     <w:p>
       <w:pPr>
+        <w:pStyle w:val="Heading1"/>
+        <w:pageBreakBefore/>
+      </w:pPr>
+      <w:r>
+        <w:t>11. Streamlit Web Interface</w:t>
+      </w:r>
+    </w:p>
+    <w:p>
+      <w:pPr/>
+      <w:r>
+        <w:t>The project now includes `app.py`, a Streamlit front end that makes the multi-agent workflow usable from a local browser. It is deliberately a thin interface: the app collects the shopping request and invokes the same `crewai run` workflow used by the command line. The agent prompts, Pydantic schemas, guardrails, and report callback remain unchanged.</w:t>
+      </w:r>
+    </w:p>
+    <w:p>
+      <w:pPr>
+        <w:pStyle w:val="Heading2"/>
+      </w:pPr>
+      <w:r>
+        <w:t>11.1 User Experience and Application Flow</w:t>
+      </w:r>
+    </w:p>
+    <w:tbl>
+      <w:tblPr>
+        <w:tblStyle w:val="TableGrid"/>
+        <w:tblW w:type="auto" w:w="0"/>
+        <w:jc w:val="center"/>
+        <w:tblLayout w:type="autofit"/>
+        <w:tblLook w:firstColumn="1" w:firstRow="1" w:lastColumn="0" w:lastRow="0" w:noHBand="0" w:noVBand="1" w:val="04A0"/>
+      </w:tblPr>
+      <w:tblGrid>
+        <w:gridCol w:w="3331"/>
+        <w:gridCol w:w="3331"/>
+        <w:gridCol w:w="3331"/>
+      </w:tblGrid>
+      <w:tr>
+        <w:trPr>
+          <w:cantSplit/>
+          <w:tblHeader w:val="true"/>
+        </w:trPr>
+        <w:tc>
+          <w:tcPr>
+            <w:tcW w:type="dxa" w:w="1656"/>
+            <w:shd w:fill="17375E"/>
+            <w:tcMar>
+              <w:top w:w="80" w:type="dxa"/>
+              <w:start w:w="90" w:type="dxa"/>
+              <w:bottom w:w="80" w:type="dxa"/>
+              <w:end w:w="90" w:type="dxa"/>
+            </w:tcMar>
+            <w:vAlign w:val="center"/>
+          </w:tcPr>
+          <w:p>
+            <w:pPr>
+              <w:spacing w:after="0" w:before="0"/>
+            </w:pPr>
+            <w:r>
+              <w:rPr>
+                <w:b/>
+                <w:color w:val="FFFFFF"/>
+                <w:sz w:val="16"/>
+              </w:rPr>
+              <w:t>Interface Element</w:t>
+            </w:r>
+          </w:p>
+        </w:tc>
+        <w:tc>
+          <w:tcPr>
+            <w:tcW w:type="dxa" w:w="3096"/>
+            <w:shd w:fill="17375E"/>
+            <w:tcMar>
+              <w:top w:w="80" w:type="dxa"/>
+              <w:start w:w="90" w:type="dxa"/>
+              <w:bottom w:w="80" w:type="dxa"/>
+              <w:end w:w="90" w:type="dxa"/>
+            </w:tcMar>
+            <w:vAlign w:val="center"/>
+          </w:tcPr>
+          <w:p>
+            <w:pPr>
+              <w:spacing w:after="0" w:before="0"/>
+            </w:pPr>
+            <w:r>
+              <w:rPr>
+                <w:b/>
+                <w:color w:val="FFFFFF"/>
+                <w:sz w:val="16"/>
+              </w:rPr>
+              <w:t>User Experience</w:t>
+            </w:r>
+          </w:p>
+        </w:tc>
+        <w:tc>
+          <w:tcPr>
+            <w:tcW w:type="dxa" w:w="4248"/>
+            <w:shd w:fill="17375E"/>
+            <w:tcMar>
+              <w:top w:w="80" w:type="dxa"/>
+              <w:start w:w="90" w:type="dxa"/>
+              <w:bottom w:w="80" w:type="dxa"/>
+              <w:end w:w="90" w:type="dxa"/>
+            </w:tcMar>
+            <w:vAlign w:val="center"/>
+          </w:tcPr>
+          <w:p>
+            <w:pPr>
+              <w:spacing w:after="0" w:before="0"/>
+            </w:pPr>
+            <w:r>
+              <w:rPr>
+                <w:b/>
+                <w:color w:val="FFFFFF"/>
+                <w:sz w:val="16"/>
+              </w:rPr>
+              <w:t>Implementation Behavior</w:t>
+            </w:r>
+          </w:p>
+        </w:tc>
+      </w:tr>
+      <w:tr>
+        <w:trPr>
+          <w:cantSplit/>
+        </w:trPr>
+        <w:tc>
+          <w:tcPr>
+            <w:tcW w:type="dxa" w:w="1656"/>
+            <w:shd w:fill="DCE8F2"/>
+            <w:tcMar>
+              <w:top w:w="80" w:type="dxa"/>
+              <w:start w:w="90" w:type="dxa"/>
+              <w:bottom w:w="80" w:type="dxa"/>
+              <w:end w:w="90" w:type="dxa"/>
+            </w:tcMar>
+            <w:vAlign w:val="center"/>
+          </w:tcPr>
+          <w:p>
+            <w:pPr>
+              <w:spacing w:after="0" w:before="0"/>
+            </w:pPr>
+            <w:r>
+              <w:rPr>
+                <w:color w:val="243447"/>
+                <w:sz w:val="16"/>
+              </w:rPr>
+              <w:t>Request entry</w:t>
+            </w:r>
+          </w:p>
+        </w:tc>
+        <w:tc>
+          <w:tcPr>
+            <w:tcW w:type="dxa" w:w="3096"/>
+            <w:shd w:fill="DCE8F2"/>
+            <w:tcMar>
+              <w:top w:w="80" w:type="dxa"/>
+              <w:start w:w="90" w:type="dxa"/>
+              <w:bottom w:w="80" w:type="dxa"/>
+              <w:end w:w="90" w:type="dxa"/>
+            </w:tcMar>
+            <w:vAlign w:val="center"/>
+          </w:tcPr>
+          <w:p>
+            <w:pPr>
+              <w:spacing w:after="0" w:before="0"/>
+            </w:pPr>
+            <w:r>
+              <w:rPr>
+                <w:color w:val="243447"/>
+                <w:sz w:val="16"/>
+              </w:rPr>
+              <w:t>Text area plus three example prompts</w:t>
+            </w:r>
+          </w:p>
+        </w:tc>
+        <w:tc>
+          <w:tcPr>
+            <w:tcW w:type="dxa" w:w="4248"/>
+            <w:shd w:fill="DCE8F2"/>
+            <w:tcMar>
+              <w:top w:w="80" w:type="dxa"/>
+              <w:start w:w="90" w:type="dxa"/>
+              <w:bottom w:w="80" w:type="dxa"/>
+              <w:end w:w="90" w:type="dxa"/>
+            </w:tcMar>
+            <w:vAlign w:val="center"/>
+          </w:tcPr>
+          <w:p>
+            <w:pPr>
+              <w:spacing w:after="0" w:before="0"/>
+            </w:pPr>
+            <w:r>
+              <w:rPr>
+                <w:color w:val="243447"/>
+                <w:sz w:val="16"/>
+              </w:rPr>
+              <w:t>Stores the selected or typed request in Streamlit session state</w:t>
+            </w:r>
+          </w:p>
+        </w:tc>
+      </w:tr>
+      <w:tr>
+        <w:trPr>
+          <w:cantSplit/>
+        </w:trPr>
+        <w:tc>
+          <w:tcPr>
+            <w:tcW w:type="dxa" w:w="1656"/>
+            <w:shd w:fill="FFFFFF"/>
+            <w:tcMar>
+              <w:top w:w="80" w:type="dxa"/>
+              <w:start w:w="90" w:type="dxa"/>
+              <w:bottom w:w="80" w:type="dxa"/>
+              <w:end w:w="90" w:type="dxa"/>
+            </w:tcMar>
+            <w:vAlign w:val="center"/>
+          </w:tcPr>
+          <w:p>
+            <w:pPr>
+              <w:spacing w:after="0" w:before="0"/>
+            </w:pPr>
+            <w:r>
+              <w:rPr>
+                <w:color w:val="243447"/>
+                <w:sz w:val="16"/>
+              </w:rPr>
+              <w:t>Run control</w:t>
+            </w:r>
+          </w:p>
+        </w:tc>
+        <w:tc>
+          <w:tcPr>
+            <w:tcW w:type="dxa" w:w="3096"/>
+            <w:shd w:fill="FFFFFF"/>
+            <w:tcMar>
+              <w:top w:w="80" w:type="dxa"/>
+              <w:start w:w="90" w:type="dxa"/>
+              <w:bottom w:w="80" w:type="dxa"/>
+              <w:end w:w="90" w:type="dxa"/>
+            </w:tcMar>
+            <w:vAlign w:val="center"/>
+          </w:tcPr>
+          <w:p>
+            <w:pPr>
+              <w:spacing w:after="0" w:before="0"/>
+            </w:pPr>
+            <w:r>
+              <w:rPr>
+                <w:color w:val="243447"/>
+                <w:sz w:val="16"/>
+              </w:rPr>
+              <w:t>Compare Products button and several-minute progress spinner</w:t>
+            </w:r>
+          </w:p>
+        </w:tc>
+        <w:tc>
+          <w:tcPr>
+            <w:tcW w:type="dxa" w:w="4248"/>
+            <w:shd w:fill="FFFFFF"/>
+            <w:tcMar>
+              <w:top w:w="80" w:type="dxa"/>
+              <w:start w:w="90" w:type="dxa"/>
+              <w:bottom w:w="80" w:type="dxa"/>
+              <w:end w:w="90" w:type="dxa"/>
+            </w:tcMar>
+            <w:vAlign w:val="center"/>
+          </w:tcPr>
+          <w:p>
+            <w:pPr>
+              <w:spacing w:after="0" w:before="0"/>
+            </w:pPr>
+            <w:r>
+              <w:rPr>
+                <w:color w:val="243447"/>
+                <w:sz w:val="16"/>
+              </w:rPr>
+              <w:t>Disables controls during a run to reduce accidental duplicate requests</w:t>
+            </w:r>
+          </w:p>
+        </w:tc>
+      </w:tr>
+      <w:tr>
+        <w:trPr>
+          <w:cantSplit/>
+        </w:trPr>
+        <w:tc>
+          <w:tcPr>
+            <w:tcW w:type="dxa" w:w="1656"/>
+            <w:shd w:fill="DCE8F2"/>
+            <w:tcMar>
+              <w:top w:w="80" w:type="dxa"/>
+              <w:start w:w="90" w:type="dxa"/>
+              <w:bottom w:w="80" w:type="dxa"/>
+              <w:end w:w="90" w:type="dxa"/>
+            </w:tcMar>
+            <w:vAlign w:val="center"/>
+          </w:tcPr>
+          <w:p>
+            <w:pPr>
+              <w:spacing w:after="0" w:before="0"/>
+            </w:pPr>
+            <w:r>
+              <w:rPr>
+                <w:color w:val="243447"/>
+                <w:sz w:val="16"/>
+              </w:rPr>
+              <w:t>Crew invocation</w:t>
+            </w:r>
+          </w:p>
+        </w:tc>
+        <w:tc>
+          <w:tcPr>
+            <w:tcW w:type="dxa" w:w="3096"/>
+            <w:shd w:fill="DCE8F2"/>
+            <w:tcMar>
+              <w:top w:w="80" w:type="dxa"/>
+              <w:start w:w="90" w:type="dxa"/>
+              <w:bottom w:w="80" w:type="dxa"/>
+              <w:end w:w="90" w:type="dxa"/>
+            </w:tcMar>
+            <w:vAlign w:val="center"/>
+          </w:tcPr>
+          <w:p>
+            <w:pPr>
+              <w:spacing w:after="0" w:before="0"/>
+            </w:pPr>
+            <w:r>
+              <w:rPr>
+                <w:color w:val="243447"/>
+                <w:sz w:val="16"/>
+              </w:rPr>
+              <w:t>No command-line knowledge required</w:t>
+            </w:r>
+          </w:p>
+        </w:tc>
+        <w:tc>
+          <w:tcPr>
+            <w:tcW w:type="dxa" w:w="4248"/>
+            <w:shd w:fill="DCE8F2"/>
+            <w:tcMar>
+              <w:top w:w="80" w:type="dxa"/>
+              <w:start w:w="90" w:type="dxa"/>
+              <w:bottom w:w="80" w:type="dxa"/>
+              <w:end w:w="90" w:type="dxa"/>
+            </w:tcMar>
+            <w:vAlign w:val="center"/>
+          </w:tcPr>
+          <w:p>
+            <w:pPr>
+              <w:spacing w:after="0" w:before="0"/>
+            </w:pPr>
+            <w:r>
+              <w:rPr>
+                <w:color w:val="243447"/>
+                <w:sz w:val="16"/>
+              </w:rPr>
+              <w:t>Serializes product_query as JSON and passes an argument list with shell disabled</w:t>
+            </w:r>
+          </w:p>
+        </w:tc>
+      </w:tr>
+      <w:tr>
+        <w:trPr>
+          <w:cantSplit/>
+        </w:trPr>
+        <w:tc>
+          <w:tcPr>
+            <w:tcW w:type="dxa" w:w="1656"/>
+            <w:shd w:fill="FFFFFF"/>
+            <w:tcMar>
+              <w:top w:w="80" w:type="dxa"/>
+              <w:start w:w="90" w:type="dxa"/>
+              <w:bottom w:w="80" w:type="dxa"/>
+              <w:end w:w="90" w:type="dxa"/>
+            </w:tcMar>
+            <w:vAlign w:val="center"/>
+          </w:tcPr>
+          <w:p>
+            <w:pPr>
+              <w:spacing w:after="0" w:before="0"/>
+            </w:pPr>
+            <w:r>
+              <w:rPr>
+                <w:color w:val="243447"/>
+                <w:sz w:val="16"/>
+              </w:rPr>
+              <w:t>Results</w:t>
+            </w:r>
+          </w:p>
+        </w:tc>
+        <w:tc>
+          <w:tcPr>
+            <w:tcW w:type="dxa" w:w="3096"/>
+            <w:shd w:fill="FFFFFF"/>
+            <w:tcMar>
+              <w:top w:w="80" w:type="dxa"/>
+              <w:start w:w="90" w:type="dxa"/>
+              <w:bottom w:w="80" w:type="dxa"/>
+              <w:end w:w="90" w:type="dxa"/>
+            </w:tcMar>
+            <w:vAlign w:val="center"/>
+          </w:tcPr>
+          <w:p>
+            <w:pPr>
+              <w:spacing w:after="0" w:before="0"/>
+            </w:pPr>
+            <w:r>
+              <w:rPr>
+                <w:color w:val="243447"/>
+                <w:sz w:val="16"/>
+              </w:rPr>
+              <w:t>Readable recommendation appears in the browser</w:t>
+            </w:r>
+          </w:p>
+        </w:tc>
+        <w:tc>
+          <w:tcPr>
+            <w:tcW w:type="dxa" w:w="4248"/>
+            <w:shd w:fill="FFFFFF"/>
+            <w:tcMar>
+              <w:top w:w="80" w:type="dxa"/>
+              <w:start w:w="90" w:type="dxa"/>
+              <w:bottom w:w="80" w:type="dxa"/>
+              <w:end w:w="90" w:type="dxa"/>
+            </w:tcMar>
+            <w:vAlign w:val="center"/>
+          </w:tcPr>
+          <w:p>
+            <w:pPr>
+              <w:spacing w:after="0" w:before="0"/>
+            </w:pPr>
+            <w:r>
+              <w:rPr>
+                <w:color w:val="243447"/>
+                <w:sz w:val="16"/>
+              </w:rPr>
+              <w:t>Renders outputs/report.md and offers Markdown/PDF download buttons</w:t>
+            </w:r>
+          </w:p>
+        </w:tc>
+      </w:tr>
+      <w:tr>
+        <w:trPr>
+          <w:cantSplit/>
+        </w:trPr>
+        <w:tc>
+          <w:tcPr>
+            <w:tcW w:type="dxa" w:w="1656"/>
+            <w:shd w:fill="DCE8F2"/>
+            <w:tcMar>
+              <w:top w:w="80" w:type="dxa"/>
+              <w:start w:w="90" w:type="dxa"/>
+              <w:bottom w:w="80" w:type="dxa"/>
+              <w:end w:w="90" w:type="dxa"/>
+            </w:tcMar>
+            <w:vAlign w:val="center"/>
+          </w:tcPr>
+          <w:p>
+            <w:pPr>
+              <w:spacing w:after="0" w:before="0"/>
+            </w:pPr>
+            <w:r>
+              <w:rPr>
+                <w:color w:val="243447"/>
+                <w:sz w:val="16"/>
+              </w:rPr>
+              <w:t>Failures</w:t>
+            </w:r>
+          </w:p>
+        </w:tc>
+        <w:tc>
+          <w:tcPr>
+            <w:tcW w:type="dxa" w:w="3096"/>
+            <w:shd w:fill="DCE8F2"/>
+            <w:tcMar>
+              <w:top w:w="80" w:type="dxa"/>
+              <w:start w:w="90" w:type="dxa"/>
+              <w:bottom w:w="80" w:type="dxa"/>
+              <w:end w:w="90" w:type="dxa"/>
+            </w:tcMar>
+            <w:vAlign w:val="center"/>
+          </w:tcPr>
+          <w:p>
+            <w:pPr>
+              <w:spacing w:after="0" w:before="0"/>
+            </w:pPr>
+            <w:r>
+              <w:rPr>
+                <w:color w:val="243447"/>
+                <w:sz w:val="16"/>
+              </w:rPr>
+              <w:t>Clear messages for rejected requests, missing keys, timeouts, and other errors</w:t>
+            </w:r>
+          </w:p>
+        </w:tc>
+        <w:tc>
+          <w:tcPr>
+            <w:tcW w:type="dxa" w:w="4248"/>
+            <w:shd w:fill="DCE8F2"/>
+            <w:tcMar>
+              <w:top w:w="80" w:type="dxa"/>
+              <w:start w:w="90" w:type="dxa"/>
+              <w:bottom w:w="80" w:type="dxa"/>
+              <w:end w:w="90" w:type="dxa"/>
+            </w:tcMar>
+            <w:vAlign w:val="center"/>
+          </w:tcPr>
+          <w:p>
+            <w:pPr>
+              <w:spacing w:after="0" w:before="0"/>
+            </w:pPr>
+            <w:r>
+              <w:rPr>
+                <w:color w:val="243447"/>
+                <w:sz w:val="16"/>
+              </w:rPr>
+              <w:t>Shows a short redacted diagnostic view and saves local troubleshooting output</w:t>
+            </w:r>
+          </w:p>
+        </w:tc>
+      </w:tr>
+    </w:tbl>
+    <w:p>
+      <w:pPr>
+        <w:pStyle w:val="Heading2"/>
+      </w:pPr>
+      <w:r>
+        <w:t>11.2 Safety, Scope, and Local Operation</w:t>
+      </w:r>
+    </w:p>
+    <w:p>
+      <w:pPr/>
+      <w:r>
+        <w:t>The interface builds the subprocess command as a list, uses JSON serialization for the request, sets `shell=False`, captures output, and applies a 600-second timeout. The existing before-kickoff callback still rejects prohibited or underspecified requests and checks required API keys before paid work. The first release is intentionally local and single-user because all runs share the same report filenames.</w:t>
+      </w:r>
+    </w:p>
+    <w:tbl>
+      <w:tblPr>
+        <w:tblW w:type="auto" w:w="0"/>
+        <w:jc w:val="center"/>
+        <w:tblLook w:firstColumn="1" w:firstRow="1" w:lastColumn="0" w:lastRow="0" w:noHBand="0" w:noVBand="1" w:val="04A0"/>
+      </w:tblPr>
+      <w:tblGrid>
+        <w:gridCol w:w="9994"/>
+      </w:tblGrid>
+      <w:tr>
+        <w:tc>
+          <w:tcPr>
+            <w:tcW w:type="dxa" w:w="9994"/>
+            <w:shd w:fill="EEF4F8"/>
+            <w:tcMar>
+              <w:top w:w="120" w:type="dxa"/>
+              <w:start w:w="150" w:type="dxa"/>
+              <w:bottom w:w="120" w:type="dxa"/>
+              <w:end w:w="150" w:type="dxa"/>
+            </w:tcMar>
+          </w:tcPr>
+          <w:p>
+            <w:pPr>
+              <w:spacing w:after="0"/>
+            </w:pPr>
+            <w:r>
+              <w:rPr>
+                <w:color w:val="243447"/>
+                <w:sz w:val="17"/>
+              </w:rPr>
+              <w:t>Launch the web interface</w:t>
+              <w:br/>
+              <w:t>uv sync --locked</w:t>
+              <w:br/>
+              <w:t>uv run streamlit run app.py</w:t>
+              <w:br/>
+              <w:br/>
+              <w:t>The browser normally opens at http://localhost:8501.</w:t>
+            </w:r>
+          </w:p>
+        </w:tc>
+      </w:tr>
+    </w:tbl>
+    <w:p>
+      <w:pPr>
         <w:pStyle w:val="SectionLabel"/>
         <w:keepNext/>
         <w:widowControl/>
@@ -3169,13 +4069,13 @@
         <w:pStyle w:val="Heading1"/>
       </w:pPr>
       <w:r>
-        <w:t>11. Educational Evaluation</w:t>
+        <w:t>12. Educational Evaluation</w:t>
       </w:r>
     </w:p>
     <w:p>
       <w:pPr/>
       <w:r>
-        <w:t>The offline test suite was run on 25 July 2026 using `python -m unittest discover -s tests -v`. All 27 tests passed without using Exa Search or DeepSeek credits. The tests demonstrate that the project is configured correctly and handles its structured outputs consistently.</w:t>
+        <w:t>The offline test suite was run on 25 July 2026 using `python -m unittest discover -s tests -v`. All 52 tests passed without using Exa Search or DeepSeek credits. The tests demonstrate that the project is configured correctly, handles its structured outputs consistently, and exercises the interface’s testable helper functions.</w:t>
       </w:r>
     </w:p>
     <w:tbl>
@@ -3297,6 +4197,7 @@
             </w:pPr>
             <w:r>
               <w:rPr>
+                <w:color w:val="243447"/>
                 <w:sz w:val="16"/>
               </w:rPr>
               <w:t>Crew configuration</w:t>
@@ -3321,6 +4222,7 @@
             </w:pPr>
             <w:r>
               <w:rPr>
+                <w:color w:val="243447"/>
                 <w:sz w:val="16"/>
               </w:rPr>
               <w:t>Three agents, tools, models, task order, and context references</w:t>
@@ -3345,6 +4247,7 @@
             </w:pPr>
             <w:r>
               <w:rPr>
+                <w:color w:val="243447"/>
                 <w:sz w:val="16"/>
               </w:rPr>
               <w:t>Passed</w:t>
@@ -3374,6 +4277,7 @@
             </w:pPr>
             <w:r>
               <w:rPr>
+                <w:color w:val="243447"/>
                 <w:sz w:val="16"/>
               </w:rPr>
               <w:t>Runtime guardrails</w:t>
@@ -3398,6 +4302,7 @@
             </w:pPr>
             <w:r>
               <w:rPr>
+                <w:color w:val="243447"/>
                 <w:sz w:val="16"/>
               </w:rPr>
               <w:t>Missing keys, prohibited requests, vague requests, and valid scoped requests</w:t>
@@ -3422,6 +4327,7 @@
             </w:pPr>
             <w:r>
               <w:rPr>
+                <w:color w:val="243447"/>
                 <w:sz w:val="16"/>
               </w:rPr>
               <w:t>Passed</w:t>
@@ -3451,6 +4357,7 @@
             </w:pPr>
             <w:r>
               <w:rPr>
+                <w:color w:val="243447"/>
                 <w:sz w:val="16"/>
               </w:rPr>
               <w:t>Structured data</w:t>
@@ -3475,6 +4382,7 @@
             </w:pPr>
             <w:r>
               <w:rPr>
+                <w:color w:val="243447"/>
                 <w:sz w:val="16"/>
               </w:rPr>
               <w:t>Exact decimals, HTTP(S) URLs, extra-field rejection, and five-product limit</w:t>
@@ -3499,6 +4407,7 @@
             </w:pPr>
             <w:r>
               <w:rPr>
+                <w:color w:val="243447"/>
                 <w:sz w:val="16"/>
               </w:rPr>
               <w:t>Passed</w:t>
@@ -3528,6 +4437,7 @@
             </w:pPr>
             <w:r>
               <w:rPr>
+                <w:color w:val="243447"/>
                 <w:sz w:val="16"/>
               </w:rPr>
               <w:t>Crew loading</w:t>
@@ -3552,6 +4462,7 @@
             </w:pPr>
             <w:r>
               <w:rPr>
+                <w:color w:val="243447"/>
                 <w:sz w:val="16"/>
               </w:rPr>
               <w:t>Schemas and final report callback resolve from the JSONC configuration</w:t>
@@ -3576,6 +4487,7 @@
             </w:pPr>
             <w:r>
               <w:rPr>
+                <w:color w:val="243447"/>
                 <w:sz w:val="16"/>
               </w:rPr>
               <w:t>Passed</w:t>
@@ -3605,6 +4517,7 @@
             </w:pPr>
             <w:r>
               <w:rPr>
+                <w:color w:val="243447"/>
                 <w:sz w:val="16"/>
               </w:rPr>
               <w:t>Report generation</w:t>
@@ -3629,6 +4542,7 @@
             </w:pPr>
             <w:r>
               <w:rPr>
+                <w:color w:val="243447"/>
                 <w:sz w:val="16"/>
               </w:rPr>
               <w:t>Readable Markdown and PDF, source links, and invalid JSON rejection</w:t>
@@ -3653,6 +4567,7 @@
             </w:pPr>
             <w:r>
               <w:rPr>
+                <w:color w:val="243447"/>
                 <w:sz w:val="16"/>
               </w:rPr>
               <w:t>Passed</w:t>
@@ -3682,6 +4597,167 @@
             </w:pPr>
             <w:r>
               <w:rPr>
+                <w:color w:val="243447"/>
+                <w:sz w:val="16"/>
+              </w:rPr>
+              <w:t>Streamlit helpers</w:t>
+            </w:r>
+          </w:p>
+        </w:tc>
+        <w:tc>
+          <w:tcPr>
+            <w:tcW w:type="dxa" w:w="5256"/>
+            <w:shd w:fill="FFFFFF"/>
+            <w:tcMar>
+              <w:top w:w="80" w:type="dxa"/>
+              <w:start w:w="90" w:type="dxa"/>
+              <w:bottom w:w="80" w:type="dxa"/>
+              <w:end w:w="90" w:type="dxa"/>
+            </w:tcMar>
+            <w:vAlign w:val="center"/>
+          </w:tcPr>
+          <w:p>
+            <w:pPr>
+              <w:spacing w:after="0" w:before="0"/>
+            </w:pPr>
+            <w:r>
+              <w:rPr>
+                <w:color w:val="243447"/>
+                <w:sz w:val="16"/>
+              </w:rPr>
+              <w:t>Input validation, safe argument construction, secret redaction, timeout handling, and failure classification</w:t>
+            </w:r>
+          </w:p>
+        </w:tc>
+        <w:tc>
+          <w:tcPr>
+            <w:tcW w:type="dxa" w:w="1800"/>
+            <w:shd w:fill="FFFFFF"/>
+            <w:tcMar>
+              <w:top w:w="80" w:type="dxa"/>
+              <w:start w:w="90" w:type="dxa"/>
+              <w:bottom w:w="80" w:type="dxa"/>
+              <w:end w:w="90" w:type="dxa"/>
+            </w:tcMar>
+            <w:vAlign w:val="center"/>
+          </w:tcPr>
+          <w:p>
+            <w:pPr>
+              <w:spacing w:after="0" w:before="0"/>
+            </w:pPr>
+            <w:r>
+              <w:rPr>
+                <w:color w:val="243447"/>
+                <w:sz w:val="16"/>
+              </w:rPr>
+              <w:t>Passed</w:t>
+            </w:r>
+          </w:p>
+        </w:tc>
+      </w:tr>
+      <w:tr>
+        <w:trPr>
+          <w:cantSplit/>
+        </w:trPr>
+        <w:tc>
+          <w:tcPr>
+            <w:tcW w:type="dxa" w:w="1944"/>
+            <w:shd w:fill="DCE8F2"/>
+            <w:tcMar>
+              <w:top w:w="80" w:type="dxa"/>
+              <w:start w:w="90" w:type="dxa"/>
+              <w:bottom w:w="80" w:type="dxa"/>
+              <w:end w:w="90" w:type="dxa"/>
+            </w:tcMar>
+            <w:vAlign w:val="center"/>
+          </w:tcPr>
+          <w:p>
+            <w:pPr>
+              <w:spacing w:after="0" w:before="0"/>
+            </w:pPr>
+            <w:r>
+              <w:rPr>
+                <w:color w:val="243447"/>
+                <w:sz w:val="16"/>
+              </w:rPr>
+              <w:t>Interface smoke check</w:t>
+            </w:r>
+          </w:p>
+        </w:tc>
+        <w:tc>
+          <w:tcPr>
+            <w:tcW w:type="dxa" w:w="5256"/>
+            <w:shd w:fill="DCE8F2"/>
+            <w:tcMar>
+              <w:top w:w="80" w:type="dxa"/>
+              <w:start w:w="90" w:type="dxa"/>
+              <w:bottom w:w="80" w:type="dxa"/>
+              <w:end w:w="90" w:type="dxa"/>
+            </w:tcMar>
+            <w:vAlign w:val="center"/>
+          </w:tcPr>
+          <w:p>
+            <w:pPr>
+              <w:spacing w:after="0" w:before="0"/>
+            </w:pPr>
+            <w:r>
+              <w:rPr>
+                <w:color w:val="243447"/>
+                <w:sz w:val="16"/>
+              </w:rPr>
+              <w:t>Initial page, four buttons, one request field, empty-input error, and example selection</w:t>
+            </w:r>
+          </w:p>
+        </w:tc>
+        <w:tc>
+          <w:tcPr>
+            <w:tcW w:type="dxa" w:w="1800"/>
+            <w:shd w:fill="DCE8F2"/>
+            <w:tcMar>
+              <w:top w:w="80" w:type="dxa"/>
+              <w:start w:w="90" w:type="dxa"/>
+              <w:bottom w:w="80" w:type="dxa"/>
+              <w:end w:w="90" w:type="dxa"/>
+            </w:tcMar>
+            <w:vAlign w:val="center"/>
+          </w:tcPr>
+          <w:p>
+            <w:pPr>
+              <w:spacing w:after="0" w:before="0"/>
+            </w:pPr>
+            <w:r>
+              <w:rPr>
+                <w:color w:val="243447"/>
+                <w:sz w:val="16"/>
+              </w:rPr>
+              <w:t>Passed offline</w:t>
+            </w:r>
+          </w:p>
+        </w:tc>
+      </w:tr>
+      <w:tr>
+        <w:trPr>
+          <w:cantSplit/>
+        </w:trPr>
+        <w:tc>
+          <w:tcPr>
+            <w:tcW w:type="dxa" w:w="1944"/>
+            <w:shd w:fill="FFFFFF"/>
+            <w:tcMar>
+              <w:top w:w="80" w:type="dxa"/>
+              <w:start w:w="90" w:type="dxa"/>
+              <w:bottom w:w="80" w:type="dxa"/>
+              <w:end w:w="90" w:type="dxa"/>
+            </w:tcMar>
+            <w:vAlign w:val="center"/>
+          </w:tcPr>
+          <w:p>
+            <w:pPr>
+              <w:spacing w:after="0" w:before="0"/>
+            </w:pPr>
+            <w:r>
+              <w:rPr>
+                <w:color w:val="243447"/>
                 <w:sz w:val="16"/>
               </w:rPr>
               <w:t>Live factual accuracy</w:t>
@@ -3706,6 +4782,7 @@
             </w:pPr>
             <w:r>
               <w:rPr>
+                <w:color w:val="243447"/>
                 <w:sz w:val="16"/>
               </w:rPr>
               <w:t>Prices, stock, seller claims, and delivery information can change online</w:t>
@@ -3730,6 +4807,7 @@
             </w:pPr>
             <w:r>
               <w:rPr>
+                <w:color w:val="243447"/>
                 <w:sz w:val="16"/>
               </w:rPr>
               <w:t>Manual verification required</w:t>
@@ -3770,7 +4848,7 @@
               </w:rPr>
               <w:t>Evaluation interpretation</w:t>
               <w:br/>
-              <w:t>Passing tests shows that the software structure, validation, and report generation work as intended. It does not prove that every live shopping claim is permanently correct, so source links and the final buying checklist remain important.</w:t>
+              <w:t>Passing tests shows that the software structure, validation, and report generation behave as expected in offline checks. The smoke check confirms that the Streamlit page loads and its non-paid interactions work. It does not replace a live end-to-end shopping run or prove that every online claim is permanently correct, so source links and the final buying checklist remain important.</w:t>
             </w:r>
           </w:p>
         </w:tc>
@@ -3786,7 +4864,7 @@
         <w:widowControl/>
       </w:pPr>
       <w:r>
-        <w:t>12. Safe-Buying Guidance</w:t>
+        <w:t>13. Safe-Buying Guidance</w:t>
       </w:r>
     </w:p>
     <w:p>
@@ -3864,7 +4942,7 @@
         <w:widowControl/>
       </w:pPr>
       <w:r>
-        <w:t>13. Current Limitations</w:t>
+        <w:t>14. Current Limitations</w:t>
       </w:r>
     </w:p>
     <w:p>
@@ -3872,7 +4950,7 @@
         <w:widowControl/>
       </w:pPr>
       <w:r>
-        <w:t>The system can reduce research time, but it cannot remove every uncertainty. Some websites block automated access, some sellers publish incomplete specifications, and shipping costs may only appear during checkout. Prices and stock can also change after the report is generated. Pydantic validates the structure of task outputs, not the truth of every claim.</w:t>
+        <w:t>The system can reduce research time, but it cannot remove every uncertainty. Some websites block automated access, some sellers publish incomplete specifications, and shipping costs may only appear during checkout. Prices and stock can also change after the report is generated. Pydantic validates the structure of task outputs, not the truth of every claim. The current Streamlit version is intended for one local user: all runs share outputs/report.md and outputs/report.pdf, so concurrent browser sessions could overwrite each other’s files.</w:t>
       </w:r>
     </w:p>
     <w:tbl>
@@ -3945,7 +5023,7 @@
         <w:widowControl/>
       </w:pPr>
       <w:r>
-        <w:t>14. Future Improvements</w:t>
+        <w:t>15. Future Improvements</w:t>
       </w:r>
     </w:p>
     <w:tbl>
@@ -4096,11 +5174,8 @@
             <w:shd w:fill="FFFFFF"/>
           </w:tcPr>
           <w:p>
-            <w:pPr>
-              <w:spacing w:after="30" w:before="0"/>
-            </w:pPr>
             <w:r>
-              <w:t>User interface</w:t>
+              <w:t>Multi-user web deployment</w:t>
             </w:r>
           </w:p>
         </w:tc>
@@ -4110,11 +5185,8 @@
             <w:shd w:fill="FFFFFF"/>
           </w:tcPr>
           <w:p>
-            <w:pPr>
-              <w:spacing w:after="30" w:before="0"/>
-            </w:pPr>
             <w:r>
-              <w:t>Provide a Streamlit dashboard with filters and comparison cards.</w:t>
+              <w:t>Add background jobs, per-run report storage, authentication, and deployment controls for concurrent users.</w:t>
             </w:r>
           </w:p>
         </w:tc>
@@ -4188,7 +5260,7 @@
         <w:widowControl/>
       </w:pPr>
       <w:r>
-        <w:t>15. Conclusion</w:t>
+        <w:t>16. Conclusion</w:t>
       </w:r>
     </w:p>
     <w:p>
@@ -4245,6 +5317,7 @@
         <w:tblStyle w:val="TableGrid"/>
         <w:tblW w:type="auto" w:w="0"/>
         <w:jc w:val="center"/>
+        <w:tblLayout w:type="autofit"/>
         <w:tblLook w:firstColumn="1" w:firstRow="1" w:lastColumn="0" w:lastRow="0" w:noHBand="0" w:noVBand="1" w:val="04A0"/>
       </w:tblPr>
       <w:tblGrid>
@@ -4255,20 +5328,30 @@
         <w:trPr>
           <w:tblHeader w:val="true"/>
           <w:cantSplit/>
+          <w:cantSplit/>
+          <w:tblHeader w:val="true"/>
         </w:trPr>
         <w:tc>
           <w:tcPr>
-            <w:tcW w:type="dxa" w:w="4997"/>
-            <w:shd w:fill="1F3A5F"/>
+            <w:tcW w:type="dxa" w:w="2376"/>
+            <w:shd w:fill="17375E"/>
+            <w:tcMar>
+              <w:top w:w="80" w:type="dxa"/>
+              <w:start w:w="90" w:type="dxa"/>
+              <w:bottom w:w="80" w:type="dxa"/>
+              <w:end w:w="90" w:type="dxa"/>
+            </w:tcMar>
+            <w:vAlign w:val="center"/>
           </w:tcPr>
           <w:p>
             <w:pPr>
-              <w:spacing w:after="30" w:before="0"/>
+              <w:spacing w:after="0" w:before="0"/>
             </w:pPr>
             <w:r>
               <w:rPr>
                 <w:b/>
                 <w:color w:val="FFFFFF"/>
+                <w:sz w:val="16"/>
               </w:rPr>
               <w:t>Item</w:t>
             </w:r>
@@ -4276,19 +5359,643 @@
         </w:tc>
         <w:tc>
           <w:tcPr>
-            <w:tcW w:type="dxa" w:w="4997"/>
-            <w:shd w:fill="1F3A5F"/>
+            <w:tcW w:type="dxa" w:w="6552"/>
+            <w:shd w:fill="17375E"/>
+            <w:tcMar>
+              <w:top w:w="80" w:type="dxa"/>
+              <w:start w:w="90" w:type="dxa"/>
+              <w:bottom w:w="80" w:type="dxa"/>
+              <w:end w:w="90" w:type="dxa"/>
+            </w:tcMar>
+            <w:vAlign w:val="center"/>
           </w:tcPr>
           <w:p>
             <w:pPr>
-              <w:spacing w:after="30" w:before="0"/>
+              <w:spacing w:after="0" w:before="0"/>
             </w:pPr>
             <w:r>
               <w:rPr>
                 <w:b/>
                 <w:color w:val="FFFFFF"/>
+                <w:sz w:val="16"/>
               </w:rPr>
               <w:t>Configuration</w:t>
+            </w:r>
+          </w:p>
+        </w:tc>
+      </w:tr>
+      <w:tr>
+        <w:trPr>
+          <w:cantSplit/>
+          <w:cantSplit/>
+        </w:trPr>
+        <w:tc>
+          <w:tcPr>
+            <w:tcW w:type="dxa" w:w="2376"/>
+            <w:shd w:fill="DCE8F2"/>
+            <w:tcMar>
+              <w:top w:w="80" w:type="dxa"/>
+              <w:start w:w="90" w:type="dxa"/>
+              <w:bottom w:w="80" w:type="dxa"/>
+              <w:end w:w="90" w:type="dxa"/>
+            </w:tcMar>
+            <w:vAlign w:val="center"/>
+          </w:tcPr>
+          <w:p>
+            <w:pPr>
+              <w:spacing w:after="0" w:before="0"/>
+            </w:pPr>
+            <w:r>
+              <w:rPr>
+                <w:color w:val="243447"/>
+                <w:sz w:val="16"/>
+              </w:rPr>
+              <w:t>Project name</w:t>
+            </w:r>
+          </w:p>
+        </w:tc>
+        <w:tc>
+          <w:tcPr>
+            <w:tcW w:type="dxa" w:w="6552"/>
+            <w:shd w:fill="DCE8F2"/>
+            <w:tcMar>
+              <w:top w:w="80" w:type="dxa"/>
+              <w:start w:w="90" w:type="dxa"/>
+              <w:bottom w:w="80" w:type="dxa"/>
+              <w:end w:w="90" w:type="dxa"/>
+            </w:tcMar>
+            <w:vAlign w:val="center"/>
+          </w:tcPr>
+          <w:p>
+            <w:pPr>
+              <w:spacing w:after="0" w:before="0"/>
+            </w:pPr>
+            <w:r>
+              <w:rPr>
+                <w:color w:val="243447"/>
+                <w:sz w:val="16"/>
+              </w:rPr>
+              <w:t>Smart Shopping &amp; Price-Comparison AI Agent</w:t>
+            </w:r>
+          </w:p>
+        </w:tc>
+      </w:tr>
+      <w:tr>
+        <w:trPr>
+          <w:cantSplit/>
+          <w:cantSplit/>
+        </w:trPr>
+        <w:tc>
+          <w:tcPr>
+            <w:tcW w:type="dxa" w:w="2376"/>
+            <w:shd w:fill="FFFFFF"/>
+            <w:tcMar>
+              <w:top w:w="80" w:type="dxa"/>
+              <w:start w:w="90" w:type="dxa"/>
+              <w:bottom w:w="80" w:type="dxa"/>
+              <w:end w:w="90" w:type="dxa"/>
+            </w:tcMar>
+            <w:vAlign w:val="center"/>
+          </w:tcPr>
+          <w:p>
+            <w:pPr>
+              <w:spacing w:after="0" w:before="0"/>
+            </w:pPr>
+            <w:r>
+              <w:rPr>
+                <w:color w:val="243447"/>
+                <w:sz w:val="16"/>
+              </w:rPr>
+              <w:t>Execution model</w:t>
+            </w:r>
+          </w:p>
+        </w:tc>
+        <w:tc>
+          <w:tcPr>
+            <w:tcW w:type="dxa" w:w="6552"/>
+            <w:shd w:fill="FFFFFF"/>
+            <w:tcMar>
+              <w:top w:w="80" w:type="dxa"/>
+              <w:start w:w="90" w:type="dxa"/>
+              <w:bottom w:w="80" w:type="dxa"/>
+              <w:end w:w="90" w:type="dxa"/>
+            </w:tcMar>
+            <w:vAlign w:val="center"/>
+          </w:tcPr>
+          <w:p>
+            <w:pPr>
+              <w:spacing w:after="0" w:before="0"/>
+            </w:pPr>
+            <w:r>
+              <w:rPr>
+                <w:color w:val="243447"/>
+                <w:sz w:val="16"/>
+              </w:rPr>
+              <w:t>Sequential multi-agent workflow</w:t>
+            </w:r>
+          </w:p>
+        </w:tc>
+      </w:tr>
+      <w:tr>
+        <w:trPr>
+          <w:cantSplit/>
+          <w:cantSplit/>
+        </w:trPr>
+        <w:tc>
+          <w:tcPr>
+            <w:tcW w:type="dxa" w:w="2376"/>
+            <w:shd w:fill="DCE8F2"/>
+            <w:tcMar>
+              <w:top w:w="80" w:type="dxa"/>
+              <w:start w:w="90" w:type="dxa"/>
+              <w:bottom w:w="80" w:type="dxa"/>
+              <w:end w:w="90" w:type="dxa"/>
+            </w:tcMar>
+            <w:vAlign w:val="center"/>
+          </w:tcPr>
+          <w:p>
+            <w:pPr>
+              <w:spacing w:after="0" w:before="0"/>
+            </w:pPr>
+            <w:r>
+              <w:rPr>
+                <w:color w:val="243447"/>
+                <w:sz w:val="16"/>
+              </w:rPr>
+              <w:t>Agents</w:t>
+            </w:r>
+          </w:p>
+        </w:tc>
+        <w:tc>
+          <w:tcPr>
+            <w:tcW w:type="dxa" w:w="6552"/>
+            <w:shd w:fill="DCE8F2"/>
+            <w:tcMar>
+              <w:top w:w="80" w:type="dxa"/>
+              <w:start w:w="90" w:type="dxa"/>
+              <w:bottom w:w="80" w:type="dxa"/>
+              <w:end w:w="90" w:type="dxa"/>
+            </w:tcMar>
+            <w:vAlign w:val="center"/>
+          </w:tcPr>
+          <w:p>
+            <w:pPr>
+              <w:spacing w:after="0" w:before="0"/>
+            </w:pPr>
+            <w:r>
+              <w:rPr>
+                <w:color w:val="243447"/>
+                <w:sz w:val="16"/>
+              </w:rPr>
+              <w:t>Product Search Specialist; Price Comparison Analyst; Product Recommendation Advisor</w:t>
+            </w:r>
+          </w:p>
+        </w:tc>
+      </w:tr>
+      <w:tr>
+        <w:trPr>
+          <w:cantSplit/>
+          <w:cantSplit/>
+        </w:trPr>
+        <w:tc>
+          <w:tcPr>
+            <w:tcW w:type="dxa" w:w="2376"/>
+            <w:shd w:fill="FFFFFF"/>
+            <w:tcMar>
+              <w:top w:w="80" w:type="dxa"/>
+              <w:start w:w="90" w:type="dxa"/>
+              <w:bottom w:w="80" w:type="dxa"/>
+              <w:end w:w="90" w:type="dxa"/>
+            </w:tcMar>
+            <w:vAlign w:val="center"/>
+          </w:tcPr>
+          <w:p>
+            <w:pPr>
+              <w:spacing w:after="0" w:before="0"/>
+            </w:pPr>
+            <w:r>
+              <w:rPr>
+                <w:color w:val="243447"/>
+                <w:sz w:val="16"/>
+              </w:rPr>
+              <w:t>Primary input</w:t>
+            </w:r>
+          </w:p>
+        </w:tc>
+        <w:tc>
+          <w:tcPr>
+            <w:tcW w:type="dxa" w:w="6552"/>
+            <w:shd w:fill="FFFFFF"/>
+            <w:tcMar>
+              <w:top w:w="80" w:type="dxa"/>
+              <w:start w:w="90" w:type="dxa"/>
+              <w:bottom w:w="80" w:type="dxa"/>
+              <w:end w:w="90" w:type="dxa"/>
+            </w:tcMar>
+            <w:vAlign w:val="center"/>
+          </w:tcPr>
+          <w:p>
+            <w:pPr>
+              <w:spacing w:after="0" w:before="0"/>
+            </w:pPr>
+            <w:r>
+              <w:rPr>
+                <w:color w:val="243447"/>
+                <w:sz w:val="16"/>
+              </w:rPr>
+              <w:t>{product_query}</w:t>
+            </w:r>
+          </w:p>
+        </w:tc>
+      </w:tr>
+      <w:tr>
+        <w:trPr>
+          <w:cantSplit/>
+          <w:cantSplit/>
+        </w:trPr>
+        <w:tc>
+          <w:tcPr>
+            <w:tcW w:type="dxa" w:w="2376"/>
+            <w:shd w:fill="DCE8F2"/>
+            <w:tcMar>
+              <w:top w:w="80" w:type="dxa"/>
+              <w:start w:w="90" w:type="dxa"/>
+              <w:bottom w:w="80" w:type="dxa"/>
+              <w:end w:w="90" w:type="dxa"/>
+            </w:tcMar>
+            <w:vAlign w:val="center"/>
+          </w:tcPr>
+          <w:p>
+            <w:pPr>
+              <w:spacing w:after="0" w:before="0"/>
+            </w:pPr>
+            <w:r>
+              <w:rPr>
+                <w:color w:val="243447"/>
+                <w:sz w:val="16"/>
+              </w:rPr>
+              <w:t>Search tool</w:t>
+            </w:r>
+          </w:p>
+        </w:tc>
+        <w:tc>
+          <w:tcPr>
+            <w:tcW w:type="dxa" w:w="6552"/>
+            <w:shd w:fill="DCE8F2"/>
+            <w:tcMar>
+              <w:top w:w="80" w:type="dxa"/>
+              <w:start w:w="90" w:type="dxa"/>
+              <w:bottom w:w="80" w:type="dxa"/>
+              <w:end w:w="90" w:type="dxa"/>
+            </w:tcMar>
+            <w:vAlign w:val="center"/>
+          </w:tcPr>
+          <w:p>
+            <w:pPr>
+              <w:spacing w:after="0" w:before="0"/>
+            </w:pPr>
+            <w:r>
+              <w:rPr>
+                <w:color w:val="243447"/>
+                <w:sz w:val="16"/>
+              </w:rPr>
+              <w:t>ExaSearchTool</w:t>
+            </w:r>
+          </w:p>
+        </w:tc>
+      </w:tr>
+      <w:tr>
+        <w:trPr>
+          <w:cantSplit/>
+          <w:cantSplit/>
+        </w:trPr>
+        <w:tc>
+          <w:tcPr>
+            <w:tcW w:type="dxa" w:w="2376"/>
+            <w:shd w:fill="FFFFFF"/>
+            <w:tcMar>
+              <w:top w:w="80" w:type="dxa"/>
+              <w:start w:w="90" w:type="dxa"/>
+              <w:bottom w:w="80" w:type="dxa"/>
+              <w:end w:w="90" w:type="dxa"/>
+            </w:tcMar>
+            <w:vAlign w:val="center"/>
+          </w:tcPr>
+          <w:p>
+            <w:pPr>
+              <w:spacing w:after="0" w:before="0"/>
+            </w:pPr>
+            <w:r>
+              <w:rPr>
+                <w:color w:val="243447"/>
+                <w:sz w:val="16"/>
+              </w:rPr>
+              <w:t>Verification tool</w:t>
+            </w:r>
+          </w:p>
+        </w:tc>
+        <w:tc>
+          <w:tcPr>
+            <w:tcW w:type="dxa" w:w="6552"/>
+            <w:shd w:fill="FFFFFF"/>
+            <w:tcMar>
+              <w:top w:w="80" w:type="dxa"/>
+              <w:start w:w="90" w:type="dxa"/>
+              <w:bottom w:w="80" w:type="dxa"/>
+              <w:end w:w="90" w:type="dxa"/>
+            </w:tcMar>
+            <w:vAlign w:val="center"/>
+          </w:tcPr>
+          <w:p>
+            <w:pPr>
+              <w:spacing w:after="0" w:before="0"/>
+            </w:pPr>
+            <w:r>
+              <w:rPr>
+                <w:color w:val="243447"/>
+                <w:sz w:val="16"/>
+              </w:rPr>
+              <w:t>ScrapeWebsiteTool</w:t>
+            </w:r>
+          </w:p>
+        </w:tc>
+      </w:tr>
+      <w:tr>
+        <w:trPr>
+          <w:cantSplit/>
+          <w:cantSplit/>
+        </w:trPr>
+        <w:tc>
+          <w:tcPr>
+            <w:tcW w:type="dxa" w:w="2376"/>
+            <w:shd w:fill="DCE8F2"/>
+            <w:tcMar>
+              <w:top w:w="80" w:type="dxa"/>
+              <w:start w:w="90" w:type="dxa"/>
+              <w:bottom w:w="80" w:type="dxa"/>
+              <w:end w:w="90" w:type="dxa"/>
+            </w:tcMar>
+            <w:vAlign w:val="center"/>
+          </w:tcPr>
+          <w:p>
+            <w:pPr>
+              <w:spacing w:after="0" w:before="0"/>
+            </w:pPr>
+            <w:r>
+              <w:rPr>
+                <w:color w:val="243447"/>
+                <w:sz w:val="16"/>
+              </w:rPr>
+              <w:t>Language model</w:t>
+            </w:r>
+          </w:p>
+        </w:tc>
+        <w:tc>
+          <w:tcPr>
+            <w:tcW w:type="dxa" w:w="6552"/>
+            <w:shd w:fill="DCE8F2"/>
+            <w:tcMar>
+              <w:top w:w="80" w:type="dxa"/>
+              <w:start w:w="90" w:type="dxa"/>
+              <w:bottom w:w="80" w:type="dxa"/>
+              <w:end w:w="90" w:type="dxa"/>
+            </w:tcMar>
+            <w:vAlign w:val="center"/>
+          </w:tcPr>
+          <w:p>
+            <w:pPr>
+              <w:spacing w:after="0" w:before="0"/>
+            </w:pPr>
+            <w:r>
+              <w:rPr>
+                <w:color w:val="243447"/>
+                <w:sz w:val="16"/>
+              </w:rPr>
+              <w:t>DeepSeek V4 Flash</w:t>
+            </w:r>
+          </w:p>
+        </w:tc>
+      </w:tr>
+      <w:tr>
+        <w:trPr>
+          <w:cantSplit/>
+          <w:cantSplit/>
+        </w:trPr>
+        <w:tc>
+          <w:tcPr>
+            <w:tcW w:type="dxa" w:w="2376"/>
+            <w:shd w:fill="FFFFFF"/>
+            <w:tcMar>
+              <w:top w:w="80" w:type="dxa"/>
+              <w:start w:w="90" w:type="dxa"/>
+              <w:bottom w:w="80" w:type="dxa"/>
+              <w:end w:w="90" w:type="dxa"/>
+            </w:tcMar>
+            <w:vAlign w:val="center"/>
+          </w:tcPr>
+          <w:p>
+            <w:pPr>
+              <w:spacing w:after="0" w:before="0"/>
+            </w:pPr>
+            <w:r>
+              <w:rPr>
+                <w:color w:val="243447"/>
+                <w:sz w:val="16"/>
+              </w:rPr>
+              <w:t>Output files</w:t>
+            </w:r>
+          </w:p>
+        </w:tc>
+        <w:tc>
+          <w:tcPr>
+            <w:tcW w:type="dxa" w:w="6552"/>
+            <w:shd w:fill="FFFFFF"/>
+            <w:tcMar>
+              <w:top w:w="80" w:type="dxa"/>
+              <w:start w:w="90" w:type="dxa"/>
+              <w:bottom w:w="80" w:type="dxa"/>
+              <w:end w:w="90" w:type="dxa"/>
+            </w:tcMar>
+            <w:vAlign w:val="center"/>
+          </w:tcPr>
+          <w:p>
+            <w:pPr>
+              <w:spacing w:after="0" w:before="0"/>
+            </w:pPr>
+            <w:r>
+              <w:rPr>
+                <w:color w:val="243447"/>
+                <w:sz w:val="16"/>
+              </w:rPr>
+              <w:t>outputs/report.md; outputs/report.pdf</w:t>
+            </w:r>
+          </w:p>
+        </w:tc>
+      </w:tr>
+      <w:tr>
+        <w:trPr>
+          <w:cantSplit/>
+          <w:cantSplit/>
+        </w:trPr>
+        <w:tc>
+          <w:tcPr>
+            <w:tcW w:type="dxa" w:w="2376"/>
+            <w:shd w:fill="DCE8F2"/>
+            <w:tcMar>
+              <w:top w:w="80" w:type="dxa"/>
+              <w:start w:w="90" w:type="dxa"/>
+              <w:bottom w:w="80" w:type="dxa"/>
+              <w:end w:w="90" w:type="dxa"/>
+            </w:tcMar>
+            <w:vAlign w:val="center"/>
+          </w:tcPr>
+          <w:p>
+            <w:pPr>
+              <w:spacing w:after="0" w:before="0"/>
+            </w:pPr>
+            <w:r>
+              <w:rPr>
+                <w:color w:val="243447"/>
+                <w:sz w:val="16"/>
+              </w:rPr>
+              <w:t>Credential storage</w:t>
+            </w:r>
+          </w:p>
+        </w:tc>
+        <w:tc>
+          <w:tcPr>
+            <w:tcW w:type="dxa" w:w="6552"/>
+            <w:shd w:fill="DCE8F2"/>
+            <w:tcMar>
+              <w:top w:w="80" w:type="dxa"/>
+              <w:start w:w="90" w:type="dxa"/>
+              <w:bottom w:w="80" w:type="dxa"/>
+              <w:end w:w="90" w:type="dxa"/>
+            </w:tcMar>
+            <w:vAlign w:val="center"/>
+          </w:tcPr>
+          <w:p>
+            <w:pPr>
+              <w:spacing w:after="0" w:before="0"/>
+            </w:pPr>
+            <w:r>
+              <w:rPr>
+                <w:color w:val="243447"/>
+                <w:sz w:val="16"/>
+              </w:rPr>
+              <w:t>.env</w:t>
+            </w:r>
+          </w:p>
+        </w:tc>
+      </w:tr>
+      <w:tr>
+        <w:trPr>
+          <w:cantSplit/>
+          <w:cantSplit/>
+        </w:trPr>
+        <w:tc>
+          <w:tcPr>
+            <w:tcW w:type="dxa" w:w="2376"/>
+            <w:shd w:fill="FFFFFF"/>
+            <w:tcMar>
+              <w:top w:w="80" w:type="dxa"/>
+              <w:start w:w="90" w:type="dxa"/>
+              <w:bottom w:w="80" w:type="dxa"/>
+              <w:end w:w="90" w:type="dxa"/>
+            </w:tcMar>
+            <w:vAlign w:val="center"/>
+          </w:tcPr>
+          <w:p>
+            <w:pPr>
+              <w:spacing w:after="0" w:before="0"/>
+            </w:pPr>
+            <w:r>
+              <w:rPr>
+                <w:color w:val="243447"/>
+                <w:sz w:val="16"/>
+              </w:rPr>
+              <w:t>Structured outputs</w:t>
+            </w:r>
+          </w:p>
+        </w:tc>
+        <w:tc>
+          <w:tcPr>
+            <w:tcW w:type="dxa" w:w="6552"/>
+            <w:shd w:fill="FFFFFF"/>
+            <w:tcMar>
+              <w:top w:w="80" w:type="dxa"/>
+              <w:start w:w="90" w:type="dxa"/>
+              <w:bottom w:w="80" w:type="dxa"/>
+              <w:end w:w="90" w:type="dxa"/>
+            </w:tcMar>
+            <w:vAlign w:val="center"/>
+          </w:tcPr>
+          <w:p>
+            <w:pPr>
+              <w:spacing w:after="0" w:before="0"/>
+            </w:pPr>
+            <w:r>
+              <w:rPr>
+                <w:color w:val="243447"/>
+                <w:sz w:val="16"/>
+              </w:rPr>
+              <w:t>ProductSearchResult; PriceComparisonResult; FinalRecommendationResult</w:t>
+            </w:r>
+          </w:p>
+        </w:tc>
+      </w:tr>
+      <w:tr>
+        <w:trPr>
+          <w:cantSplit/>
+          <w:cantSplit/>
+        </w:trPr>
+        <w:tc>
+          <w:tcPr>
+            <w:tcW w:type="dxa" w:w="2376"/>
+            <w:shd w:fill="DCE8F2"/>
+            <w:tcMar>
+              <w:top w:w="80" w:type="dxa"/>
+              <w:start w:w="90" w:type="dxa"/>
+              <w:bottom w:w="80" w:type="dxa"/>
+              <w:end w:w="90" w:type="dxa"/>
+            </w:tcMar>
+            <w:vAlign w:val="center"/>
+          </w:tcPr>
+          <w:p>
+            <w:pPr>
+              <w:spacing w:after="0" w:before="0"/>
+            </w:pPr>
+            <w:r>
+              <w:rPr>
+                <w:color w:val="243447"/>
+                <w:sz w:val="16"/>
+              </w:rPr>
+              <w:t>Report renderer</w:t>
+            </w:r>
+          </w:p>
+        </w:tc>
+        <w:tc>
+          <w:tcPr>
+            <w:tcW w:type="dxa" w:w="6552"/>
+            <w:shd w:fill="DCE8F2"/>
+            <w:tcMar>
+              <w:top w:w="80" w:type="dxa"/>
+              <w:start w:w="90" w:type="dxa"/>
+              <w:bottom w:w="80" w:type="dxa"/>
+              <w:end w:w="90" w:type="dxa"/>
+            </w:tcMar>
+            <w:vAlign w:val="center"/>
+          </w:tcPr>
+          <w:p>
+            <w:pPr>
+              <w:spacing w:after="0" w:before="0"/>
+            </w:pPr>
+            <w:r>
+              <w:rPr>
+                <w:color w:val="243447"/>
+                <w:sz w:val="16"/>
+              </w:rPr>
+              <w:t>tools.reporting.save_recommendation_report</w:t>
             </w:r>
           </w:p>
         </w:tc>
@@ -4299,350 +6006,51 @@
         </w:trPr>
         <w:tc>
           <w:tcPr>
-            <w:tcW w:type="dxa" w:w="4997"/>
-            <w:shd w:fill="DCE8F4"/>
+            <w:tcW w:type="dxa" w:w="2376"/>
+            <w:shd w:fill="FFFFFF"/>
+            <w:tcMar>
+              <w:top w:w="80" w:type="dxa"/>
+              <w:start w:w="90" w:type="dxa"/>
+              <w:bottom w:w="80" w:type="dxa"/>
+              <w:end w:w="90" w:type="dxa"/>
+            </w:tcMar>
+            <w:vAlign w:val="center"/>
           </w:tcPr>
           <w:p>
             <w:pPr>
-              <w:spacing w:after="30" w:before="0"/>
+              <w:spacing w:after="0" w:before="0"/>
             </w:pPr>
             <w:r>
-              <w:t>Project name</w:t>
+              <w:rPr>
+                <w:color w:val="243447"/>
+                <w:sz w:val="16"/>
+              </w:rPr>
+              <w:t>Web interface</w:t>
             </w:r>
           </w:p>
         </w:tc>
         <w:tc>
           <w:tcPr>
-            <w:tcW w:type="dxa" w:w="4997"/>
-            <w:shd w:fill="DCE8F4"/>
+            <w:tcW w:type="dxa" w:w="6552"/>
+            <w:shd w:fill="FFFFFF"/>
+            <w:tcMar>
+              <w:top w:w="80" w:type="dxa"/>
+              <w:start w:w="90" w:type="dxa"/>
+              <w:bottom w:w="80" w:type="dxa"/>
+              <w:end w:w="90" w:type="dxa"/>
+            </w:tcMar>
+            <w:vAlign w:val="center"/>
           </w:tcPr>
           <w:p>
             <w:pPr>
-              <w:spacing w:after="30" w:before="0"/>
+              <w:spacing w:after="0" w:before="0"/>
             </w:pPr>
             <w:r>
-              <w:t>Smart Shopping &amp; Price-Comparison AI Agent</w:t>
-            </w:r>
-          </w:p>
-        </w:tc>
-      </w:tr>
-      <w:tr>
-        <w:trPr>
-          <w:cantSplit/>
-        </w:trPr>
-        <w:tc>
-          <w:tcPr>
-            <w:tcW w:type="dxa" w:w="4997"/>
-            <w:shd w:fill="FFFFFF"/>
-          </w:tcPr>
-          <w:p>
-            <w:pPr>
-              <w:spacing w:after="30" w:before="0"/>
-            </w:pPr>
-            <w:r>
-              <w:t>Execution model</w:t>
-            </w:r>
-          </w:p>
-        </w:tc>
-        <w:tc>
-          <w:tcPr>
-            <w:tcW w:type="dxa" w:w="4997"/>
-            <w:shd w:fill="FFFFFF"/>
-          </w:tcPr>
-          <w:p>
-            <w:pPr>
-              <w:spacing w:after="30" w:before="0"/>
-            </w:pPr>
-            <w:r>
-              <w:t>Sequential multi-agent workflow</w:t>
-            </w:r>
-          </w:p>
-        </w:tc>
-      </w:tr>
-      <w:tr>
-        <w:trPr>
-          <w:cantSplit/>
-        </w:trPr>
-        <w:tc>
-          <w:tcPr>
-            <w:tcW w:type="dxa" w:w="4997"/>
-            <w:shd w:fill="DCE8F4"/>
-          </w:tcPr>
-          <w:p>
-            <w:pPr>
-              <w:spacing w:after="30" w:before="0"/>
-            </w:pPr>
-            <w:r>
-              <w:t>Agents</w:t>
-            </w:r>
-          </w:p>
-        </w:tc>
-        <w:tc>
-          <w:tcPr>
-            <w:tcW w:type="dxa" w:w="4997"/>
-            <w:shd w:fill="DCE8F4"/>
-          </w:tcPr>
-          <w:p>
-            <w:pPr>
-              <w:spacing w:after="30" w:before="0"/>
-            </w:pPr>
-            <w:r>
-              <w:t>Product Search Specialist; Price Comparison Analyst; Product Recommendation Advisor</w:t>
-            </w:r>
-          </w:p>
-        </w:tc>
-      </w:tr>
-      <w:tr>
-        <w:trPr>
-          <w:cantSplit/>
-        </w:trPr>
-        <w:tc>
-          <w:tcPr>
-            <w:tcW w:type="dxa" w:w="4997"/>
-            <w:shd w:fill="FFFFFF"/>
-          </w:tcPr>
-          <w:p>
-            <w:pPr>
-              <w:spacing w:after="30" w:before="0"/>
-            </w:pPr>
-            <w:r>
-              <w:t>Primary input</w:t>
-            </w:r>
-          </w:p>
-        </w:tc>
-        <w:tc>
-          <w:tcPr>
-            <w:tcW w:type="dxa" w:w="4997"/>
-            <w:shd w:fill="FFFFFF"/>
-          </w:tcPr>
-          <w:p>
-            <w:pPr>
-              <w:spacing w:after="30" w:before="0"/>
-            </w:pPr>
-            <w:r>
-              <w:t>{product_query}</w:t>
-            </w:r>
-          </w:p>
-        </w:tc>
-      </w:tr>
-      <w:tr>
-        <w:trPr>
-          <w:cantSplit/>
-        </w:trPr>
-        <w:tc>
-          <w:tcPr>
-            <w:tcW w:type="dxa" w:w="4997"/>
-            <w:shd w:fill="DCE8F4"/>
-          </w:tcPr>
-          <w:p>
-            <w:pPr>
-              <w:spacing w:after="30" w:before="0"/>
-            </w:pPr>
-            <w:r>
-              <w:t>Search tool</w:t>
-            </w:r>
-          </w:p>
-        </w:tc>
-        <w:tc>
-          <w:tcPr>
-            <w:tcW w:type="dxa" w:w="4997"/>
-            <w:shd w:fill="DCE8F4"/>
-          </w:tcPr>
-          <w:p>
-            <w:pPr>
-              <w:spacing w:after="30" w:before="0"/>
-            </w:pPr>
-            <w:r>
-              <w:t>ExaSearchTool</w:t>
-            </w:r>
-          </w:p>
-        </w:tc>
-      </w:tr>
-      <w:tr>
-        <w:trPr>
-          <w:cantSplit/>
-        </w:trPr>
-        <w:tc>
-          <w:tcPr>
-            <w:tcW w:type="dxa" w:w="4997"/>
-            <w:shd w:fill="FFFFFF"/>
-          </w:tcPr>
-          <w:p>
-            <w:pPr>
-              <w:spacing w:after="30" w:before="0"/>
-            </w:pPr>
-            <w:r>
-              <w:t>Verification tool</w:t>
-            </w:r>
-          </w:p>
-        </w:tc>
-        <w:tc>
-          <w:tcPr>
-            <w:tcW w:type="dxa" w:w="4997"/>
-            <w:shd w:fill="FFFFFF"/>
-          </w:tcPr>
-          <w:p>
-            <w:pPr>
-              <w:spacing w:after="30" w:before="0"/>
-            </w:pPr>
-            <w:r>
-              <w:t>ScrapeWebsiteTool</w:t>
-            </w:r>
-          </w:p>
-        </w:tc>
-      </w:tr>
-      <w:tr>
-        <w:trPr>
-          <w:cantSplit/>
-        </w:trPr>
-        <w:tc>
-          <w:tcPr>
-            <w:tcW w:type="dxa" w:w="4997"/>
-            <w:shd w:fill="DCE8F4"/>
-          </w:tcPr>
-          <w:p>
-            <w:pPr>
-              <w:spacing w:after="30" w:before="0"/>
-            </w:pPr>
-            <w:r>
-              <w:t>Language model</w:t>
-            </w:r>
-          </w:p>
-        </w:tc>
-        <w:tc>
-          <w:tcPr>
-            <w:tcW w:type="dxa" w:w="4997"/>
-            <w:shd w:fill="DCE8F4"/>
-          </w:tcPr>
-          <w:p>
-            <w:pPr>
-              <w:spacing w:after="30" w:before="0"/>
-            </w:pPr>
-            <w:r>
-              <w:t>DeepSeek V4 Flash</w:t>
-            </w:r>
-          </w:p>
-        </w:tc>
-      </w:tr>
-      <w:tr>
-        <w:trPr>
-          <w:cantSplit/>
-        </w:trPr>
-        <w:tc>
-          <w:tcPr>
-            <w:tcW w:type="dxa" w:w="4997"/>
-            <w:shd w:fill="FFFFFF"/>
-          </w:tcPr>
-          <w:p>
-            <w:r>
-              <w:t>Output files</w:t>
-            </w:r>
-          </w:p>
-        </w:tc>
-        <w:tc>
-          <w:tcPr>
-            <w:tcW w:type="dxa" w:w="4997"/>
-            <w:shd w:fill="FFFFFF"/>
-          </w:tcPr>
-          <w:p>
-            <w:r>
-              <w:t>outputs/report.md; outputs/report.pdf</w:t>
-            </w:r>
-          </w:p>
-        </w:tc>
-      </w:tr>
-      <w:tr>
-        <w:trPr>
-          <w:cantSplit/>
-        </w:trPr>
-        <w:tc>
-          <w:tcPr>
-            <w:tcW w:type="dxa" w:w="4997"/>
-            <w:shd w:fill="DCE8F4"/>
-          </w:tcPr>
-          <w:p>
-            <w:pPr>
-              <w:spacing w:after="30" w:before="0"/>
-            </w:pPr>
-            <w:r>
-              <w:t>Credential storage</w:t>
-            </w:r>
-          </w:p>
-        </w:tc>
-        <w:tc>
-          <w:tcPr>
-            <w:tcW w:type="dxa" w:w="4997"/>
-            <w:shd w:fill="DCE8F4"/>
-          </w:tcPr>
-          <w:p>
-            <w:pPr>
-              <w:spacing w:after="30" w:before="0"/>
-            </w:pPr>
-            <w:r>
-              <w:t>.env</w:t>
-            </w:r>
-          </w:p>
-        </w:tc>
-      </w:tr>
-      <w:tr>
-        <w:trPr>
-          <w:cantSplit/>
-        </w:trPr>
-        <w:tc>
-          <w:tcPr>
-            <w:tcW w:type="dxa" w:w="4997"/>
-            <w:shd w:fill="DCE8F4"/>
-          </w:tcPr>
-          <w:p>
-            <w:pPr>
-              <w:spacing w:after="30" w:before="0"/>
-            </w:pPr>
-            <w:r>
-              <w:t>Structured outputs</w:t>
-            </w:r>
-          </w:p>
-        </w:tc>
-        <w:tc>
-          <w:tcPr>
-            <w:tcW w:type="dxa" w:w="4997"/>
-            <w:shd w:fill="DCE8F4"/>
-          </w:tcPr>
-          <w:p>
-            <w:pPr>
-              <w:spacing w:after="30" w:before="0"/>
-            </w:pPr>
-            <w:r>
-              <w:t>ProductSearchResult; PriceComparisonResult; FinalRecommendationResult</w:t>
-            </w:r>
-          </w:p>
-        </w:tc>
-      </w:tr>
-      <w:tr>
-        <w:trPr>
-          <w:cantSplit/>
-        </w:trPr>
-        <w:tc>
-          <w:tcPr>
-            <w:tcW w:type="dxa" w:w="4997"/>
-            <w:shd w:fill="DCE8F4"/>
-          </w:tcPr>
-          <w:p>
-            <w:pPr>
-              <w:spacing w:after="30" w:before="0"/>
-            </w:pPr>
-            <w:r>
-              <w:t>Report renderer</w:t>
-            </w:r>
-          </w:p>
-        </w:tc>
-        <w:tc>
-          <w:tcPr>
-            <w:tcW w:type="dxa" w:w="4997"/>
-            <w:shd w:fill="DCE8F4"/>
-          </w:tcPr>
-          <w:p>
-            <w:r>
-              <w:t>tools.reporting.save_recommendation_report</w:t>
+              <w:rPr>
+                <w:color w:val="243447"/>
+                <w:sz w:val="16"/>
+              </w:rPr>
+              <w:t>Streamlit 1.60.0 in app.py</w:t>
             </w:r>
           </w:p>
         </w:tc>
@@ -4739,16 +6147,15 @@
             </w:tcMar>
           </w:tcPr>
           <w:p>
-            <w:pPr>
-              <w:spacing w:after="30" w:before="0"/>
-            </w:pPr>
             <w:r>
-              <w:rPr>
-                <w:rFonts w:ascii="Liberation Mono" w:hAnsi="Liberation Mono"/>
-                <w:color w:val="222222"/>
-                <w:sz w:val="19"/>
-              </w:rPr>
               <w:t>cd ~/smart_shopping_price_comparison_agent</w:t>
+              <w:br/>
+              <w:t>uv sync --locked</w:t>
+              <w:br/>
+              <w:t>uv run streamlit run app.py</w:t>
+              <w:br/>
+              <w:br/>
+              <w:t>CLI alternative:</w:t>
               <w:br/>
               <w:t>uv run crewai run</w:t>
             </w:r>

</xml_diff>